<commit_message>
Add IT647 Lecture PDF and update Final.docx
Add new lecture file IT647-Lecture 5.pdf and update Project/Final.docx. Also includes an updated temporary MS Office lock file (~$Final.docx). These changes add lecture materials and incorporate revisions to the project final document.
</commit_message>
<xml_diff>
--- a/Chapter Two 1447/IT 647 Data Mining and Business Intelligence/Project/Final.docx
+++ b/Chapter Two 1447/IT 647 Data Mining and Business Intelligence/Project/Final.docx
@@ -49,15 +49,15 @@
         <w:jc w:val="both"/>
         <w:rPr>
           <w:rFonts w:ascii="Times New Roman" w:eastAsia="Google Sans" w:hAnsi="Times New Roman" w:cs="Times New Roman"/>
-          <w:sz w:val="24"/>
-          <w:szCs w:val="24"/>
-        </w:rPr>
-      </w:pPr>
-      <w:r>
-        <w:rPr>
-          <w:rFonts w:ascii="Times New Roman" w:eastAsia="Google Sans" w:hAnsi="Times New Roman" w:cs="Times New Roman"/>
-          <w:sz w:val="24"/>
-          <w:szCs w:val="24"/>
+          <w:sz w:val="28"/>
+          <w:szCs w:val="28"/>
+        </w:rPr>
+      </w:pPr>
+      <w:r>
+        <w:rPr>
+          <w:rFonts w:ascii="Times New Roman" w:eastAsia="Google Sans" w:hAnsi="Times New Roman" w:cs="Times New Roman"/>
+          <w:sz w:val="28"/>
+          <w:szCs w:val="28"/>
         </w:rPr>
         <w:t>1.1. Background and Context of Business Intelligence</w:t>
       </w:r>
@@ -107,15 +107,15 @@
         <w:jc w:val="both"/>
         <w:rPr>
           <w:rFonts w:ascii="Times New Roman" w:eastAsia="Google Sans" w:hAnsi="Times New Roman" w:cs="Times New Roman"/>
-          <w:sz w:val="24"/>
-          <w:szCs w:val="24"/>
-        </w:rPr>
-      </w:pPr>
-      <w:r>
-        <w:rPr>
-          <w:rFonts w:ascii="Times New Roman" w:eastAsia="Google Sans" w:hAnsi="Times New Roman" w:cs="Times New Roman"/>
-          <w:sz w:val="24"/>
-          <w:szCs w:val="24"/>
+          <w:sz w:val="28"/>
+          <w:szCs w:val="28"/>
+        </w:rPr>
+      </w:pPr>
+      <w:r>
+        <w:rPr>
+          <w:rFonts w:ascii="Times New Roman" w:eastAsia="Google Sans" w:hAnsi="Times New Roman" w:cs="Times New Roman"/>
+          <w:sz w:val="28"/>
+          <w:szCs w:val="28"/>
         </w:rPr>
         <w:t>1.2. The Synergy between BI and Machine Learning</w:t>
       </w:r>
@@ -165,15 +165,15 @@
         <w:jc w:val="both"/>
         <w:rPr>
           <w:rFonts w:ascii="Times New Roman" w:eastAsia="Google Sans" w:hAnsi="Times New Roman" w:cs="Times New Roman"/>
-          <w:sz w:val="24"/>
-          <w:szCs w:val="24"/>
-        </w:rPr>
-      </w:pPr>
-      <w:r>
-        <w:rPr>
-          <w:rFonts w:ascii="Times New Roman" w:eastAsia="Google Sans" w:hAnsi="Times New Roman" w:cs="Times New Roman"/>
-          <w:sz w:val="24"/>
-          <w:szCs w:val="24"/>
+          <w:sz w:val="28"/>
+          <w:szCs w:val="28"/>
+        </w:rPr>
+      </w:pPr>
+      <w:r>
+        <w:rPr>
+          <w:rFonts w:ascii="Times New Roman" w:eastAsia="Google Sans" w:hAnsi="Times New Roman" w:cs="Times New Roman"/>
+          <w:sz w:val="28"/>
+          <w:szCs w:val="28"/>
         </w:rPr>
         <w:t>1.3. Core Definitions</w:t>
       </w:r>
@@ -265,15 +265,15 @@
         <w:jc w:val="both"/>
         <w:rPr>
           <w:rFonts w:ascii="Times New Roman" w:eastAsia="Google Sans" w:hAnsi="Times New Roman" w:cs="Times New Roman"/>
-          <w:sz w:val="24"/>
-          <w:szCs w:val="24"/>
-        </w:rPr>
-      </w:pPr>
-      <w:r>
-        <w:rPr>
-          <w:rFonts w:ascii="Times New Roman" w:eastAsia="Google Sans" w:hAnsi="Times New Roman" w:cs="Times New Roman"/>
-          <w:sz w:val="24"/>
-          <w:szCs w:val="24"/>
+          <w:sz w:val="28"/>
+          <w:szCs w:val="28"/>
+        </w:rPr>
+      </w:pPr>
+      <w:r>
+        <w:rPr>
+          <w:rFonts w:ascii="Times New Roman" w:eastAsia="Google Sans" w:hAnsi="Times New Roman" w:cs="Times New Roman"/>
+          <w:sz w:val="28"/>
+          <w:szCs w:val="28"/>
         </w:rPr>
         <w:t>1.4. Problem Statement</w:t>
       </w:r>
@@ -473,15 +473,15 @@
         <w:jc w:val="both"/>
         <w:rPr>
           <w:rFonts w:ascii="Times New Roman" w:eastAsia="Google Sans" w:hAnsi="Times New Roman" w:cs="Times New Roman"/>
-          <w:sz w:val="24"/>
-          <w:szCs w:val="24"/>
-        </w:rPr>
-      </w:pPr>
-      <w:r>
-        <w:rPr>
-          <w:rFonts w:ascii="Times New Roman" w:eastAsia="Google Sans" w:hAnsi="Times New Roman" w:cs="Times New Roman"/>
-          <w:sz w:val="24"/>
-          <w:szCs w:val="24"/>
+          <w:sz w:val="28"/>
+          <w:szCs w:val="28"/>
+        </w:rPr>
+      </w:pPr>
+      <w:r>
+        <w:rPr>
+          <w:rFonts w:ascii="Times New Roman" w:eastAsia="Google Sans" w:hAnsi="Times New Roman" w:cs="Times New Roman"/>
+          <w:sz w:val="28"/>
+          <w:szCs w:val="28"/>
         </w:rPr>
         <w:t>1.5. Proposed Idea and Scope</w:t>
       </w:r>
@@ -646,15 +646,15 @@
         <w:jc w:val="both"/>
         <w:rPr>
           <w:rFonts w:ascii="Times New Roman" w:eastAsia="Google Sans" w:hAnsi="Times New Roman" w:cs="Times New Roman"/>
-          <w:sz w:val="24"/>
-          <w:szCs w:val="24"/>
-        </w:rPr>
-      </w:pPr>
-      <w:r>
-        <w:rPr>
-          <w:rFonts w:ascii="Times New Roman" w:eastAsia="Google Sans" w:hAnsi="Times New Roman" w:cs="Times New Roman"/>
-          <w:sz w:val="24"/>
-          <w:szCs w:val="24"/>
+          <w:sz w:val="28"/>
+          <w:szCs w:val="28"/>
+        </w:rPr>
+      </w:pPr>
+      <w:r>
+        <w:rPr>
+          <w:rFonts w:ascii="Times New Roman" w:eastAsia="Google Sans" w:hAnsi="Times New Roman" w:cs="Times New Roman"/>
+          <w:sz w:val="28"/>
+          <w:szCs w:val="28"/>
         </w:rPr>
         <w:t>1.6. Project Objectives</w:t>
       </w:r>
@@ -805,15 +805,15 @@
         <w:jc w:val="both"/>
         <w:rPr>
           <w:rFonts w:ascii="Times New Roman" w:eastAsia="Google Sans" w:hAnsi="Times New Roman" w:cs="Times New Roman"/>
-          <w:sz w:val="24"/>
-          <w:szCs w:val="24"/>
-        </w:rPr>
-      </w:pPr>
-      <w:r>
-        <w:rPr>
-          <w:rFonts w:ascii="Times New Roman" w:eastAsia="Google Sans" w:hAnsi="Times New Roman" w:cs="Times New Roman"/>
-          <w:sz w:val="24"/>
-          <w:szCs w:val="24"/>
+          <w:sz w:val="28"/>
+          <w:szCs w:val="28"/>
+        </w:rPr>
+      </w:pPr>
+      <w:r>
+        <w:rPr>
+          <w:rFonts w:ascii="Times New Roman" w:eastAsia="Google Sans" w:hAnsi="Times New Roman" w:cs="Times New Roman"/>
+          <w:sz w:val="28"/>
+          <w:szCs w:val="28"/>
         </w:rPr>
         <w:t>1.7. Research Questions (RQ)</w:t>
       </w:r>
@@ -964,15 +964,15 @@
         <w:jc w:val="both"/>
         <w:rPr>
           <w:rFonts w:ascii="Times New Roman" w:eastAsia="Google Sans" w:hAnsi="Times New Roman" w:cs="Times New Roman"/>
-          <w:sz w:val="24"/>
-          <w:szCs w:val="24"/>
-        </w:rPr>
-      </w:pPr>
-      <w:r>
-        <w:rPr>
-          <w:rFonts w:ascii="Times New Roman" w:eastAsia="Google Sans" w:hAnsi="Times New Roman" w:cs="Times New Roman"/>
-          <w:sz w:val="24"/>
-          <w:szCs w:val="24"/>
+          <w:sz w:val="28"/>
+          <w:szCs w:val="28"/>
+        </w:rPr>
+      </w:pPr>
+      <w:r>
+        <w:rPr>
+          <w:rFonts w:ascii="Times New Roman" w:eastAsia="Google Sans" w:hAnsi="Times New Roman" w:cs="Times New Roman"/>
+          <w:sz w:val="28"/>
+          <w:szCs w:val="28"/>
         </w:rPr>
         <w:lastRenderedPageBreak/>
         <w:t>1.8. Importance of the Study</w:t>
@@ -1074,6 +1074,79 @@
     </w:p>
     <w:p>
       <w:pPr>
+        <w:pStyle w:val="Heading2"/>
+        <w:jc w:val="both"/>
+        <w:rPr>
+          <w:rFonts w:ascii="Times New Roman" w:hAnsi="Times New Roman" w:cs="Times New Roman"/>
+          <w:sz w:val="28"/>
+          <w:szCs w:val="28"/>
+        </w:rPr>
+      </w:pPr>
+      <w:r>
+        <w:rPr>
+          <w:rFonts w:ascii="Times New Roman" w:hAnsi="Times New Roman" w:cs="Times New Roman"/>
+          <w:sz w:val="28"/>
+          <w:szCs w:val="28"/>
+        </w:rPr>
+        <w:t>2.1 Introduction</w:t>
+      </w:r>
+    </w:p>
+    <w:p>
+      <w:pPr>
+        <w:spacing w:line="360" w:lineRule="auto"/>
+        <w:jc w:val="both"/>
+        <w:rPr>
+          <w:rFonts w:ascii="Times New Roman" w:hAnsi="Times New Roman" w:cs="Times New Roman"/>
+          <w:sz w:val="24"/>
+          <w:szCs w:val="24"/>
+        </w:rPr>
+      </w:pPr>
+      <w:r>
+        <w:rPr>
+          <w:rFonts w:ascii="Times New Roman" w:hAnsi="Times New Roman" w:cs="Times New Roman"/>
+          <w:sz w:val="24"/>
+          <w:szCs w:val="24"/>
+        </w:rPr>
+        <w:t>The integration of Business Intelligence (BI) and Machine Learning (ML) for e-commerce sales forecasting represents a convergence of two traditionally distinct paradigms: descriptive analytics and predictive analytics. This literature review examines the theoretical foundations, methodological developments, and empirical findings that inform the development of an integrated BI-ML approach for e-commerce sales forecasting. The review is organized into five thematic sections: (1) traditional forecasting methods and their limitations, (2) machine learning applications in sales forecasting, (3) business intelligence frameworks for e-commerce, (4) integration strategies for BI and ML systems, and (5) evaluation frameworks and performance metrics.</w:t>
+      </w:r>
+    </w:p>
+    <w:p>
+      <w:pPr>
+        <w:pStyle w:val="Heading2"/>
+        <w:jc w:val="both"/>
+        <w:rPr>
+          <w:rFonts w:ascii="Times New Roman" w:hAnsi="Times New Roman" w:cs="Times New Roman"/>
+          <w:sz w:val="28"/>
+          <w:szCs w:val="28"/>
+        </w:rPr>
+      </w:pPr>
+      <w:r>
+        <w:rPr>
+          <w:rFonts w:ascii="Times New Roman" w:hAnsi="Times New Roman" w:cs="Times New Roman"/>
+          <w:sz w:val="28"/>
+          <w:szCs w:val="28"/>
+        </w:rPr>
+        <w:t>2.</w:t>
+      </w:r>
+      <w:r>
+        <w:rPr>
+          <w:rFonts w:ascii="Times New Roman" w:hAnsi="Times New Roman" w:cs="Times New Roman"/>
+          <w:sz w:val="28"/>
+          <w:szCs w:val="28"/>
+        </w:rPr>
+        <w:t>2</w:t>
+      </w:r>
+      <w:r>
+        <w:rPr>
+          <w:rFonts w:ascii="Times New Roman" w:hAnsi="Times New Roman" w:cs="Times New Roman"/>
+          <w:sz w:val="28"/>
+          <w:szCs w:val="28"/>
+        </w:rPr>
+        <w:t xml:space="preserve"> Traditional Forecasting Methods in E-Commerce</w:t>
+      </w:r>
+    </w:p>
+    <w:p>
+      <w:pPr>
         <w:spacing w:line="360" w:lineRule="auto"/>
         <w:jc w:val="both"/>
         <w:rPr>
@@ -1144,7 +1217,16 @@
           <w:sz w:val="24"/>
           <w:szCs w:val="24"/>
         </w:rPr>
-        <w:t xml:space="preserve"> et al. [3] showed that there is no universal statistical method that performs better than others in different datasets. More importantly, these competitions unveiled that the more traditional approaches fail to work with datasets that have high volatility, promotional interventions, and non-linear relationships which are all attributes of e-commerce sales data.</w:t>
+        <w:t xml:space="preserve"> et al. [3] showed that there is no universal statistical method that performs better than others in different </w:t>
+      </w:r>
+      <w:r>
+        <w:rPr>
+          <w:rFonts w:ascii="Times New Roman" w:hAnsi="Times New Roman" w:cs="Times New Roman"/>
+          <w:sz w:val="24"/>
+          <w:szCs w:val="24"/>
+        </w:rPr>
+        <w:lastRenderedPageBreak/>
+        <w:t>datasets. More importantly, these competitions unveiled that the more traditional approaches fail to work with datasets that have high volatility, promotional interventions, and non-linear relationships which are all attributes of e-commerce sales data.</w:t>
       </w:r>
     </w:p>
     <w:p>
@@ -1200,7 +1282,116 @@
           <w:sz w:val="24"/>
           <w:szCs w:val="24"/>
         </w:rPr>
-        <w:t xml:space="preserve"> [5], the definition of the traditional models does not bring exogenous variables to the fore. Although ARIMA with exogenous inputs (ARIMAX) </w:t>
+        <w:t xml:space="preserve"> [5], the definition of the traditional models does not bring exogenous variables to the fore. Although ARIMA with exogenous inputs (ARIMAX) theoretically allows the addition of external factors, the linearity assumption makes it incapable of producing any complex interaction between variables, including price fluctuations, competitor behaviors, and customer moods. The paper found that under the conditions of the conditions of the e-commerce platforms with dynamic pricing and frequent promotions, the traditional statistical models make forecast errors more than 30% in the period of the peaks.</w:t>
+      </w:r>
+    </w:p>
+    <w:p>
+      <w:pPr>
+        <w:pStyle w:val="Heading2"/>
+        <w:jc w:val="both"/>
+        <w:rPr>
+          <w:rFonts w:ascii="Times New Roman" w:hAnsi="Times New Roman" w:cs="Times New Roman"/>
+          <w:sz w:val="28"/>
+          <w:szCs w:val="28"/>
+        </w:rPr>
+      </w:pPr>
+      <w:r>
+        <w:rPr>
+          <w:rFonts w:ascii="Times New Roman" w:hAnsi="Times New Roman" w:cs="Times New Roman"/>
+          <w:sz w:val="28"/>
+          <w:szCs w:val="28"/>
+        </w:rPr>
+        <w:t>2.</w:t>
+      </w:r>
+      <w:r>
+        <w:rPr>
+          <w:rFonts w:ascii="Times New Roman" w:hAnsi="Times New Roman" w:cs="Times New Roman"/>
+          <w:sz w:val="28"/>
+          <w:szCs w:val="28"/>
+        </w:rPr>
+        <w:t>3</w:t>
+      </w:r>
+      <w:r>
+        <w:rPr>
+          <w:rFonts w:ascii="Times New Roman" w:hAnsi="Times New Roman" w:cs="Times New Roman"/>
+          <w:sz w:val="28"/>
+          <w:szCs w:val="28"/>
+        </w:rPr>
+        <w:t xml:space="preserve"> Machine Learning Approaches to Sales Forecasting</w:t>
+      </w:r>
+    </w:p>
+    <w:p>
+      <w:pPr>
+        <w:spacing w:line="360" w:lineRule="auto"/>
+        <w:jc w:val="both"/>
+        <w:rPr>
+          <w:rFonts w:ascii="Times New Roman" w:hAnsi="Times New Roman" w:cs="Times New Roman"/>
+          <w:sz w:val="24"/>
+          <w:szCs w:val="24"/>
+        </w:rPr>
+      </w:pPr>
+      <w:r>
+        <w:rPr>
+          <w:rFonts w:ascii="Times New Roman" w:hAnsi="Times New Roman" w:cs="Times New Roman"/>
+          <w:sz w:val="24"/>
+          <w:szCs w:val="24"/>
+        </w:rPr>
+        <w:t xml:space="preserve">XGBoost (Extreme Gradient Boosting) proposed by Chen and </w:t>
+      </w:r>
+      <w:proofErr w:type="spellStart"/>
+      <w:r>
+        <w:rPr>
+          <w:rFonts w:ascii="Times New Roman" w:hAnsi="Times New Roman" w:cs="Times New Roman"/>
+          <w:sz w:val="24"/>
+          <w:szCs w:val="24"/>
+        </w:rPr>
+        <w:t>Guestrin</w:t>
+      </w:r>
+      <w:proofErr w:type="spellEnd"/>
+      <w:r>
+        <w:rPr>
+          <w:rFonts w:ascii="Times New Roman" w:hAnsi="Times New Roman" w:cs="Times New Roman"/>
+          <w:sz w:val="24"/>
+          <w:szCs w:val="24"/>
+        </w:rPr>
+        <w:t xml:space="preserve"> [6] has now become one of the landmark algorithms when it comes to sales forecasting tasks. The algorithm uses gradient boosting framework with regularization to avoid overfitting, which is an important factor when using high-dimensional e-commerce data. The authors proved that XGBoost is always better in structured problems of data when compared to the traditional methods and is more accurate but computationally efficient.</w:t>
+      </w:r>
+    </w:p>
+    <w:p>
+      <w:pPr>
+        <w:spacing w:line="360" w:lineRule="auto"/>
+        <w:jc w:val="both"/>
+        <w:rPr>
+          <w:rFonts w:ascii="Times New Roman" w:hAnsi="Times New Roman" w:cs="Times New Roman"/>
+          <w:sz w:val="24"/>
+          <w:szCs w:val="24"/>
+        </w:rPr>
+      </w:pPr>
+      <w:r>
+        <w:rPr>
+          <w:rFonts w:ascii="Times New Roman" w:hAnsi="Times New Roman" w:cs="Times New Roman"/>
+          <w:sz w:val="24"/>
+          <w:szCs w:val="24"/>
+        </w:rPr>
+        <w:t xml:space="preserve">These findings have been confirmed by comparative studies in e-commerce situations. </w:t>
+      </w:r>
+      <w:proofErr w:type="spellStart"/>
+      <w:r>
+        <w:rPr>
+          <w:rFonts w:ascii="Times New Roman" w:hAnsi="Times New Roman" w:cs="Times New Roman"/>
+          <w:sz w:val="24"/>
+          <w:szCs w:val="24"/>
+        </w:rPr>
+        <w:t>Pavlyshenko</w:t>
+      </w:r>
+      <w:proofErr w:type="spellEnd"/>
+      <w:r>
+        <w:rPr>
+          <w:rFonts w:ascii="Times New Roman" w:hAnsi="Times New Roman" w:cs="Times New Roman"/>
+          <w:sz w:val="24"/>
+          <w:szCs w:val="24"/>
+        </w:rPr>
+        <w:t xml:space="preserve"> [5] compared several machine learning algorithms such as XGBoost, Random Forest, and neural networks with the ARIMA models based on the data of an online retailer. The research discovered that XGBoost minimized the forecasting error by 23.2 percent on average over ARIMA and the effects were more significant during promotional events. It was found that the algorithms had the capability of automatically taking into account the interaction effect of features like the </w:t>
       </w:r>
       <w:r>
         <w:rPr>
@@ -1209,26 +1400,26 @@
           <w:szCs w:val="24"/>
         </w:rPr>
         <w:lastRenderedPageBreak/>
-        <w:t>theoretically allows the addition of external factors, the linearity assumption makes it incapable of producing any complex interaction between variables, including price fluctuations, competitor behaviors, and customer moods. The paper found that under the conditions of the conditions of the e-commerce platforms with dynamic pricing and frequent promotions, the traditional statistical models make forecast errors more than 30% in the period of the peaks.</w:t>
-      </w:r>
-    </w:p>
-    <w:p>
-      <w:pPr>
-        <w:spacing w:line="360" w:lineRule="auto"/>
-        <w:jc w:val="both"/>
-        <w:rPr>
-          <w:rFonts w:ascii="Times New Roman" w:hAnsi="Times New Roman" w:cs="Times New Roman"/>
-          <w:sz w:val="24"/>
-          <w:szCs w:val="24"/>
-        </w:rPr>
-      </w:pPr>
-      <w:r>
-        <w:rPr>
-          <w:rFonts w:ascii="Times New Roman" w:hAnsi="Times New Roman" w:cs="Times New Roman"/>
-          <w:sz w:val="24"/>
-          <w:szCs w:val="24"/>
-        </w:rPr>
-        <w:t xml:space="preserve">XGBoost (Extreme Gradient Boosting) proposed by Chen and </w:t>
+        <w:t>combined effect of discount percentage and product category, as one of the modes of superior performance.</w:t>
+      </w:r>
+    </w:p>
+    <w:p>
+      <w:pPr>
+        <w:spacing w:line="360" w:lineRule="auto"/>
+        <w:jc w:val="both"/>
+        <w:rPr>
+          <w:rFonts w:ascii="Times New Roman" w:hAnsi="Times New Roman" w:cs="Times New Roman"/>
+          <w:sz w:val="24"/>
+          <w:szCs w:val="24"/>
+        </w:rPr>
+      </w:pPr>
+      <w:r>
+        <w:rPr>
+          <w:rFonts w:ascii="Times New Roman" w:hAnsi="Times New Roman" w:cs="Times New Roman"/>
+          <w:sz w:val="24"/>
+          <w:szCs w:val="24"/>
+        </w:rPr>
+        <w:t xml:space="preserve">Another improvement was introduced by </w:t>
       </w:r>
       <w:proofErr w:type="spellStart"/>
       <w:r>
@@ -1237,7 +1428,7 @@
           <w:sz w:val="24"/>
           <w:szCs w:val="24"/>
         </w:rPr>
-        <w:t>Guestrin</w:t>
+        <w:t>LightGBM</w:t>
       </w:r>
       <w:proofErr w:type="spellEnd"/>
       <w:r>
@@ -1246,26 +1437,7 @@
           <w:sz w:val="24"/>
           <w:szCs w:val="24"/>
         </w:rPr>
-        <w:t xml:space="preserve"> [6] has now become one of the landmark algorithms when it comes to sales forecasting tasks. The algorithm uses gradient boosting framework with regularization to avoid overfitting, which is an important factor when using high-dimensional e-commerce data. The authors proved that XGBoost is always better in structured problems of data when compared to the traditional methods and is more accurate but computationally efficient.</w:t>
-      </w:r>
-    </w:p>
-    <w:p>
-      <w:pPr>
-        <w:spacing w:line="360" w:lineRule="auto"/>
-        <w:jc w:val="both"/>
-        <w:rPr>
-          <w:rFonts w:ascii="Times New Roman" w:hAnsi="Times New Roman" w:cs="Times New Roman"/>
-          <w:sz w:val="24"/>
-          <w:szCs w:val="24"/>
-        </w:rPr>
-      </w:pPr>
-      <w:r>
-        <w:rPr>
-          <w:rFonts w:ascii="Times New Roman" w:hAnsi="Times New Roman" w:cs="Times New Roman"/>
-          <w:sz w:val="24"/>
-          <w:szCs w:val="24"/>
-        </w:rPr>
-        <w:t xml:space="preserve">These findings have been confirmed by comparative studies in e-commerce situations. </w:t>
+        <w:t xml:space="preserve"> that was proposed by </w:t>
       </w:r>
       <w:proofErr w:type="spellStart"/>
       <w:r>
@@ -1274,7 +1446,7 @@
           <w:sz w:val="24"/>
           <w:szCs w:val="24"/>
         </w:rPr>
-        <w:t>Pavlyshenko</w:t>
+        <w:t>Ke</w:t>
       </w:r>
       <w:proofErr w:type="spellEnd"/>
       <w:r>
@@ -1283,26 +1455,157 @@
           <w:sz w:val="24"/>
           <w:szCs w:val="24"/>
         </w:rPr>
-        <w:t xml:space="preserve"> [5] compared several machine learning algorithms such as XGBoost, Random Forest, and neural networks with the ARIMA models based on the data of an online retailer. The research discovered that XGBoost minimized the forecasting error by 23.2 percent on average over ARIMA and the effects were more significant during promotional events. It was found that the algorithms had the capability of automatically taking into account the interaction effect of features like the combined effect of discount percentage and product category, as one of the modes of superior performance.</w:t>
-      </w:r>
-    </w:p>
-    <w:p>
-      <w:pPr>
-        <w:spacing w:line="360" w:lineRule="auto"/>
-        <w:jc w:val="both"/>
-        <w:rPr>
-          <w:rFonts w:ascii="Times New Roman" w:hAnsi="Times New Roman" w:cs="Times New Roman"/>
-          <w:sz w:val="24"/>
-          <w:szCs w:val="24"/>
-        </w:rPr>
-      </w:pPr>
-      <w:r>
-        <w:rPr>
-          <w:rFonts w:ascii="Times New Roman" w:hAnsi="Times New Roman" w:cs="Times New Roman"/>
-          <w:sz w:val="24"/>
-          <w:szCs w:val="24"/>
-        </w:rPr>
-        <w:t xml:space="preserve">Another improvement was introduced by </w:t>
+        <w:t xml:space="preserve"> et al. [7], which employed the use of gradient-based one-sided sampling and exclusive feature bundling. Such innovations allow reducing training time without loss or degradation in accuracy, and thus the algorithm can be used especially well in the e-commerce application, where one needs frequent model retraining. The fact that the categorical features are processed by the algorithm without the need to encode them as one-hot is also a simplification in terms of integrating it with the BI systems that tend to store categorical data like product categories and customer segments.</w:t>
+      </w:r>
+    </w:p>
+    <w:p>
+      <w:pPr>
+        <w:spacing w:line="360" w:lineRule="auto"/>
+        <w:jc w:val="both"/>
+        <w:rPr>
+          <w:rFonts w:ascii="Times New Roman" w:hAnsi="Times New Roman" w:cs="Times New Roman"/>
+          <w:sz w:val="24"/>
+          <w:szCs w:val="24"/>
+        </w:rPr>
+      </w:pPr>
+      <w:r>
+        <w:rPr>
+          <w:rFonts w:ascii="Times New Roman" w:hAnsi="Times New Roman" w:cs="Times New Roman"/>
+          <w:sz w:val="24"/>
+          <w:szCs w:val="24"/>
+        </w:rPr>
+        <w:t>S. S. R. K. T. V. S. Kiran [8] used LSTM networks to SKU-level e-commerce forecasting and also stated that it outperformed ARIMA and feed-forward neural networks. Nevertheless, the author observed that LSTM models take considerable amounts of training data and computational resources and can be a challenge when it comes to deploying smaller e-commerce processes.</w:t>
+      </w:r>
+    </w:p>
+    <w:p>
+      <w:pPr>
+        <w:spacing w:line="360" w:lineRule="auto"/>
+        <w:jc w:val="both"/>
+        <w:rPr>
+          <w:rFonts w:ascii="Times New Roman" w:hAnsi="Times New Roman" w:cs="Times New Roman"/>
+          <w:sz w:val="24"/>
+          <w:szCs w:val="24"/>
+        </w:rPr>
+      </w:pPr>
+      <w:r>
+        <w:rPr>
+          <w:rFonts w:ascii="Times New Roman" w:hAnsi="Times New Roman" w:cs="Times New Roman"/>
+          <w:sz w:val="24"/>
+          <w:szCs w:val="24"/>
+        </w:rPr>
+        <w:t>Attention-based architectures have also recently shown state of the art performance in time series forecasting. The Transformer architecture, presented by Vaswani et al. [9] instead of recurrent connections substitutes them with self-attention mechanisms. To do sales forecasting Wu et al. [10] suggested the Informer model, which is quadratically simple, but offers long-sequence forecasting. These architectures provide the chance to represent short-term fluctuations and long-term dependencies at the same time.</w:t>
+      </w:r>
+    </w:p>
+    <w:p>
+      <w:pPr>
+        <w:spacing w:line="360" w:lineRule="auto"/>
+        <w:jc w:val="both"/>
+        <w:rPr>
+          <w:rFonts w:ascii="Times New Roman" w:hAnsi="Times New Roman" w:cs="Times New Roman"/>
+          <w:sz w:val="24"/>
+          <w:szCs w:val="24"/>
+        </w:rPr>
+      </w:pPr>
+      <w:r>
+        <w:rPr>
+          <w:rFonts w:ascii="Times New Roman" w:hAnsi="Times New Roman" w:cs="Times New Roman"/>
+          <w:sz w:val="24"/>
+          <w:szCs w:val="24"/>
+        </w:rPr>
+        <w:t>Bontempi et al. [11] came up with an algorithm form of integrating ARIMA and neural networks, with ARIMA representing the linear aspects and neural networks representing the non-linear trends in the residues. The experimental analysis of e-commerce data proved that this hybrid model can reduce the error rates compared to either technique. The modular architecture of the framework is also compatible with integrated BI-ML systems in which various components may be processed using distinct data streams.</w:t>
+      </w:r>
+    </w:p>
+    <w:p>
+      <w:pPr>
+        <w:spacing w:line="360" w:lineRule="auto"/>
+        <w:jc w:val="both"/>
+        <w:rPr>
+          <w:rFonts w:ascii="Times New Roman" w:hAnsi="Times New Roman" w:cs="Times New Roman"/>
+          <w:sz w:val="24"/>
+          <w:szCs w:val="24"/>
+        </w:rPr>
+      </w:pPr>
+      <w:r>
+        <w:rPr>
+          <w:rFonts w:ascii="Times New Roman" w:hAnsi="Times New Roman" w:cs="Times New Roman"/>
+          <w:sz w:val="24"/>
+          <w:szCs w:val="24"/>
+        </w:rPr>
+        <w:t>On the same note, Bandara et al. [12] presented a hybrid method that uses exponential smoothing and LSTM networks. The research established that exponential smoothing of the data to remove trend and seasonality was a significant performance enhancement of LSTM since this step enabled the neural network to concentrate on the more valuable non-linear association as opposed to underpinning temporal trends.</w:t>
+      </w:r>
+    </w:p>
+    <w:p>
+      <w:pPr>
+        <w:pStyle w:val="Heading2"/>
+        <w:jc w:val="both"/>
+        <w:rPr>
+          <w:rFonts w:ascii="Times New Roman" w:hAnsi="Times New Roman" w:cs="Times New Roman"/>
+          <w:sz w:val="28"/>
+          <w:szCs w:val="28"/>
+        </w:rPr>
+      </w:pPr>
+      <w:r>
+        <w:rPr>
+          <w:rFonts w:ascii="Times New Roman" w:hAnsi="Times New Roman" w:cs="Times New Roman"/>
+          <w:sz w:val="28"/>
+          <w:szCs w:val="28"/>
+        </w:rPr>
+        <w:lastRenderedPageBreak/>
+        <w:t>2.</w:t>
+      </w:r>
+      <w:r>
+        <w:rPr>
+          <w:rFonts w:ascii="Times New Roman" w:hAnsi="Times New Roman" w:cs="Times New Roman"/>
+          <w:sz w:val="28"/>
+          <w:szCs w:val="28"/>
+        </w:rPr>
+        <w:t>4</w:t>
+      </w:r>
+      <w:r>
+        <w:rPr>
+          <w:rFonts w:ascii="Times New Roman" w:hAnsi="Times New Roman" w:cs="Times New Roman"/>
+          <w:sz w:val="28"/>
+          <w:szCs w:val="28"/>
+        </w:rPr>
+        <w:t xml:space="preserve"> Business Intelligence Frameworks for E-Commerce</w:t>
+      </w:r>
+    </w:p>
+    <w:p>
+      <w:pPr>
+        <w:spacing w:line="360" w:lineRule="auto"/>
+        <w:jc w:val="both"/>
+        <w:rPr>
+          <w:rFonts w:ascii="Times New Roman" w:hAnsi="Times New Roman" w:cs="Times New Roman"/>
+          <w:sz w:val="24"/>
+          <w:szCs w:val="24"/>
+        </w:rPr>
+      </w:pPr>
+      <w:r>
+        <w:rPr>
+          <w:rFonts w:ascii="Times New Roman" w:hAnsi="Times New Roman" w:cs="Times New Roman"/>
+          <w:sz w:val="24"/>
+          <w:szCs w:val="24"/>
+        </w:rPr>
+        <w:t>Any BI system is based on the data architecture. Kimball and Ross [13] made the dimensional modeling approach the overall paradigm in the data warehousing. The star schema, which is made of fact tables which hold the quantitative values and dimension tables which hold the descriptive information, gives the business users an intuitive design but the query performance is achieved efficiently.</w:t>
+      </w:r>
+    </w:p>
+    <w:p>
+      <w:pPr>
+        <w:spacing w:line="360" w:lineRule="auto"/>
+        <w:jc w:val="both"/>
+        <w:rPr>
+          <w:rFonts w:ascii="Times New Roman" w:hAnsi="Times New Roman" w:cs="Times New Roman"/>
+          <w:sz w:val="24"/>
+          <w:szCs w:val="24"/>
+        </w:rPr>
+      </w:pPr>
+      <w:r>
+        <w:rPr>
+          <w:rFonts w:ascii="Times New Roman" w:hAnsi="Times New Roman" w:cs="Times New Roman"/>
+          <w:sz w:val="24"/>
+          <w:szCs w:val="24"/>
+        </w:rPr>
+        <w:t xml:space="preserve">In the case of e-commerce applications, there have arisen certain dimensional modeling patterns. The table of facts identified by </w:t>
       </w:r>
       <w:proofErr w:type="spellStart"/>
       <w:r>
@@ -1311,7 +1614,7 @@
           <w:sz w:val="24"/>
           <w:szCs w:val="24"/>
         </w:rPr>
-        <w:t>LightGBM</w:t>
+        <w:t>Golfarelli</w:t>
       </w:r>
       <w:proofErr w:type="spellEnd"/>
       <w:r>
@@ -1320,7 +1623,129 @@
           <w:sz w:val="24"/>
           <w:szCs w:val="24"/>
         </w:rPr>
-        <w:t xml:space="preserve"> that was proposed by </w:t>
+        <w:t xml:space="preserve"> and Rizzi [14] are sales transactions, movements and interacts with customers, and these dimensions are in turn divided into time, product, customer and channel. The authors have stressed that a properly built data warehouse is not just used to conduct reporting but also to provide an uncontaminated and coherent dataset to train the ML model which is considered a vital factor of integrated BI-ML systems.</w:t>
+      </w:r>
+    </w:p>
+    <w:p>
+      <w:pPr>
+        <w:spacing w:line="360" w:lineRule="auto"/>
+        <w:jc w:val="both"/>
+        <w:rPr>
+          <w:rFonts w:ascii="Times New Roman" w:hAnsi="Times New Roman" w:cs="Times New Roman"/>
+          <w:sz w:val="24"/>
+          <w:szCs w:val="24"/>
+        </w:rPr>
+      </w:pPr>
+      <w:r>
+        <w:rPr>
+          <w:rFonts w:ascii="Times New Roman" w:hAnsi="Times New Roman" w:cs="Times New Roman"/>
+          <w:sz w:val="24"/>
+          <w:szCs w:val="24"/>
+        </w:rPr>
+        <w:t>The most common interface of business stakeholders with BI systems is descriptive analytics, which is implemented using interactive dashboards. The design principles of effective dashboards were developed by Few et al. [15], since it is necessary to pay attention to such aspects of a good dashboard as visual hierarchy, contextual information, and actionable metrics. In the case of sales forecasting applications, dashboards should not only show the values of the forecasts but also the uncertainty range and factors that contributes to making appropriate decisions.</w:t>
+      </w:r>
+    </w:p>
+    <w:p>
+      <w:pPr>
+        <w:pStyle w:val="Heading2"/>
+        <w:rPr>
+          <w:rFonts w:ascii="Times New Roman" w:hAnsi="Times New Roman" w:cs="Times New Roman"/>
+          <w:sz w:val="28"/>
+          <w:szCs w:val="28"/>
+        </w:rPr>
+      </w:pPr>
+      <w:r>
+        <w:rPr>
+          <w:rFonts w:ascii="Times New Roman" w:hAnsi="Times New Roman" w:cs="Times New Roman"/>
+          <w:sz w:val="28"/>
+          <w:szCs w:val="28"/>
+        </w:rPr>
+        <w:t>2.5 Integration of Business Intelligence and Machine Learning</w:t>
+      </w:r>
+    </w:p>
+    <w:p>
+      <w:pPr>
+        <w:spacing w:line="360" w:lineRule="auto"/>
+        <w:jc w:val="both"/>
+        <w:rPr>
+          <w:rFonts w:ascii="Times New Roman" w:hAnsi="Times New Roman" w:cs="Times New Roman"/>
+          <w:sz w:val="24"/>
+          <w:szCs w:val="24"/>
+        </w:rPr>
+      </w:pPr>
+      <w:r>
+        <w:rPr>
+          <w:rFonts w:ascii="Times New Roman" w:hAnsi="Times New Roman" w:cs="Times New Roman"/>
+          <w:sz w:val="24"/>
+          <w:szCs w:val="24"/>
+        </w:rPr>
+        <w:t>BI and ML systems integration have both technical and organizational challenges. The systematic literature review by Popovic et al. [16] into the business intelligence and analytics domain revealed that the gap between the descriptive and predictive analytics in the aspects of integration was one of the issues that remained constant. The authors suggested a maturity model in which organizations move to individual BI and ML implementations to combined systems with predictions entrenched in the BI dashboards and BI insights guiding the creation of features to the ML models.</w:t>
+      </w:r>
+    </w:p>
+    <w:p>
+      <w:pPr>
+        <w:spacing w:line="360" w:lineRule="auto"/>
+        <w:jc w:val="both"/>
+        <w:rPr>
+          <w:rFonts w:ascii="Times New Roman" w:hAnsi="Times New Roman" w:cs="Times New Roman"/>
+          <w:sz w:val="24"/>
+          <w:szCs w:val="24"/>
+        </w:rPr>
+      </w:pPr>
+      <w:r>
+        <w:rPr>
+          <w:rFonts w:ascii="Times New Roman" w:hAnsi="Times New Roman" w:cs="Times New Roman"/>
+          <w:sz w:val="24"/>
+          <w:szCs w:val="24"/>
+        </w:rPr>
+        <w:t xml:space="preserve">Apache Spark is a comprehensive engine of big data processing that is proposed by Zaharia et al. [17] and can be used to execute both BI workloads and ML workloads. This integrated architecture makes it easier to maintain a separate pipeline of reporting and modeling and therefore organizations have the capability of implementing integrated systems in a more cost-effective way. </w:t>
+      </w:r>
+      <w:r>
+        <w:rPr>
+          <w:rFonts w:ascii="Times New Roman" w:hAnsi="Times New Roman" w:cs="Times New Roman"/>
+          <w:sz w:val="24"/>
+          <w:szCs w:val="24"/>
+        </w:rPr>
+        <w:lastRenderedPageBreak/>
+        <w:t>In the case of e-commerce applications, the fact that it is able to make use of streaming data to generate real-time features is an enormous plus.</w:t>
+      </w:r>
+    </w:p>
+    <w:p>
+      <w:pPr>
+        <w:spacing w:line="360" w:lineRule="auto"/>
+        <w:jc w:val="both"/>
+        <w:rPr>
+          <w:rFonts w:ascii="Times New Roman" w:hAnsi="Times New Roman" w:cs="Times New Roman"/>
+          <w:sz w:val="24"/>
+          <w:szCs w:val="24"/>
+        </w:rPr>
+      </w:pPr>
+      <w:r>
+        <w:rPr>
+          <w:rFonts w:ascii="Times New Roman" w:hAnsi="Times New Roman" w:cs="Times New Roman"/>
+          <w:sz w:val="24"/>
+          <w:szCs w:val="24"/>
+        </w:rPr>
+        <w:t>The essential complication in the implementation of ML alongside BI is the black box character of intricate models. Barredo Arrieta et al. [18] presented a taxonomy of explainable artificial intelligence (XAI) techniques in detail, differentiating between methods of intrinsically interpretable models and post-hoc explanation methods. In the case of BI dashboards that are required to assist in business decision-making, the authors highlighted that the explanations should be given in accordance with the technical capabilities of the stakeholder.</w:t>
+      </w:r>
+    </w:p>
+    <w:p>
+      <w:pPr>
+        <w:spacing w:line="360" w:lineRule="auto"/>
+        <w:jc w:val="both"/>
+        <w:rPr>
+          <w:rFonts w:ascii="Times New Roman" w:hAnsi="Times New Roman" w:cs="Times New Roman"/>
+          <w:sz w:val="24"/>
+          <w:szCs w:val="24"/>
+        </w:rPr>
+      </w:pPr>
+      <w:r>
+        <w:rPr>
+          <w:rFonts w:ascii="Times New Roman" w:hAnsi="Times New Roman" w:cs="Times New Roman"/>
+          <w:sz w:val="24"/>
+          <w:szCs w:val="24"/>
+        </w:rPr>
+        <w:t>Lundberg and Lee [19] came up with SHAP (</w:t>
       </w:r>
       <w:proofErr w:type="spellStart"/>
       <w:r>
@@ -1329,7 +1754,7 @@
           <w:sz w:val="24"/>
           <w:szCs w:val="24"/>
         </w:rPr>
-        <w:t>Ke</w:t>
+        <w:t>SHapley</w:t>
       </w:r>
       <w:proofErr w:type="spellEnd"/>
       <w:r>
@@ -1338,45 +1763,169 @@
           <w:sz w:val="24"/>
           <w:szCs w:val="24"/>
         </w:rPr>
-        <w:t xml:space="preserve"> et al. [7], which employed the use of gradient-based one-sided sampling and exclusive feature bundling. Such innovations allow reducing training time without loss or degradation in accuracy, and thus the algorithm can be used especially well in the e-commerce application, where one needs frequent model retraining. The fact that the categorical features are processed by the algorithm without the need to encode them as one-hot is also a simplification in terms of integrating it with the BI systems that tend to store categorical data like product categories and customer segments.</w:t>
-      </w:r>
-    </w:p>
-    <w:p>
-      <w:pPr>
-        <w:spacing w:line="360" w:lineRule="auto"/>
-        <w:jc w:val="both"/>
-        <w:rPr>
-          <w:rFonts w:ascii="Times New Roman" w:hAnsi="Times New Roman" w:cs="Times New Roman"/>
-          <w:sz w:val="24"/>
-          <w:szCs w:val="24"/>
-        </w:rPr>
-      </w:pPr>
-      <w:r>
-        <w:rPr>
-          <w:rFonts w:ascii="Times New Roman" w:hAnsi="Times New Roman" w:cs="Times New Roman"/>
-          <w:sz w:val="24"/>
-          <w:szCs w:val="24"/>
-        </w:rPr>
-        <w:t>S. S. R. K. T. V. S. Kiran [8] used LSTM networks to SKU-level e-commerce forecasting and also stated that it outperformed ARIMA and feed-forward neural networks. Nevertheless, the author observed that LSTM models take considerable amounts of training data and computational resources and can be a challenge when it comes to deploying smaller e-commerce processes.</w:t>
-      </w:r>
-    </w:p>
-    <w:p>
-      <w:pPr>
-        <w:spacing w:line="360" w:lineRule="auto"/>
-        <w:jc w:val="both"/>
-        <w:rPr>
-          <w:rFonts w:ascii="Times New Roman" w:hAnsi="Times New Roman" w:cs="Times New Roman"/>
-          <w:sz w:val="24"/>
-          <w:szCs w:val="24"/>
-        </w:rPr>
-      </w:pPr>
-      <w:r>
-        <w:rPr>
-          <w:rFonts w:ascii="Times New Roman" w:hAnsi="Times New Roman" w:cs="Times New Roman"/>
-          <w:sz w:val="24"/>
-          <w:szCs w:val="24"/>
-        </w:rPr>
-        <w:t xml:space="preserve">Attention-based architectures have also recently shown state of the art performance in time series </w:t>
+        <w:t xml:space="preserve"> Additive </w:t>
+      </w:r>
+      <w:proofErr w:type="spellStart"/>
+      <w:r>
+        <w:rPr>
+          <w:rFonts w:ascii="Times New Roman" w:hAnsi="Times New Roman" w:cs="Times New Roman"/>
+          <w:sz w:val="24"/>
+          <w:szCs w:val="24"/>
+        </w:rPr>
+        <w:t>exPlanations</w:t>
+      </w:r>
+      <w:proofErr w:type="spellEnd"/>
+      <w:r>
+        <w:rPr>
+          <w:rFonts w:ascii="Times New Roman" w:hAnsi="Times New Roman" w:cs="Times New Roman"/>
+          <w:sz w:val="24"/>
+          <w:szCs w:val="24"/>
+        </w:rPr>
+        <w:t>), a single framework of interpreting model predictions in terms of cooperative game theory. SHAP values break down predictions into feature contributions, which present consistent explanations that can be represented in BI dashboards. In the case of sales forecasting, SHAP explanations can determine whether a decrease in a forecast is caused by seasonality, price variation, or external variables that allow stakeholders to make the right decisions.</w:t>
+      </w:r>
+    </w:p>
+    <w:p>
+      <w:pPr>
+        <w:spacing w:line="360" w:lineRule="auto"/>
+        <w:jc w:val="both"/>
+        <w:rPr>
+          <w:rFonts w:ascii="Times New Roman" w:hAnsi="Times New Roman" w:cs="Times New Roman"/>
+          <w:sz w:val="24"/>
+          <w:szCs w:val="24"/>
+        </w:rPr>
+      </w:pPr>
+      <w:r>
+        <w:rPr>
+          <w:rFonts w:ascii="Times New Roman" w:hAnsi="Times New Roman" w:cs="Times New Roman"/>
+          <w:sz w:val="24"/>
+          <w:szCs w:val="24"/>
+        </w:rPr>
+        <w:t>Sculley et al. [20] pointed at the concept of the hidden technical debt of machine learning systems and suggested that the ML algorithm comprises of a very small part of the overall complexity of the system. The authors named data validation, feature management, and model monitoring as the most important elements that are frequently overlooked in research-oriented ML projects. In case of integrated BI-ML systems, these factors are further enhanced by the requirement to ensure compatibility with particular BI infrastructure present.</w:t>
+      </w:r>
+    </w:p>
+    <w:p>
+      <w:pPr>
+        <w:spacing w:line="360" w:lineRule="auto"/>
+        <w:jc w:val="both"/>
+        <w:rPr>
+          <w:rFonts w:ascii="Times New Roman" w:hAnsi="Times New Roman" w:cs="Times New Roman"/>
+          <w:sz w:val="24"/>
+          <w:szCs w:val="24"/>
+        </w:rPr>
+      </w:pPr>
+      <w:proofErr w:type="spellStart"/>
+      <w:r>
+        <w:rPr>
+          <w:rFonts w:ascii="Times New Roman" w:hAnsi="Times New Roman" w:cs="Times New Roman"/>
+          <w:sz w:val="24"/>
+          <w:szCs w:val="24"/>
+        </w:rPr>
+        <w:t>Kreuzberger</w:t>
+      </w:r>
+      <w:proofErr w:type="spellEnd"/>
+      <w:r>
+        <w:rPr>
+          <w:rFonts w:ascii="Times New Roman" w:hAnsi="Times New Roman" w:cs="Times New Roman"/>
+          <w:sz w:val="24"/>
+          <w:szCs w:val="24"/>
+        </w:rPr>
+        <w:t xml:space="preserve"> et al. [21] offered a systemic overview of </w:t>
+      </w:r>
+      <w:proofErr w:type="spellStart"/>
+      <w:r>
+        <w:rPr>
+          <w:rFonts w:ascii="Times New Roman" w:hAnsi="Times New Roman" w:cs="Times New Roman"/>
+          <w:sz w:val="24"/>
+          <w:szCs w:val="24"/>
+        </w:rPr>
+        <w:t>MLOps</w:t>
+      </w:r>
+      <w:proofErr w:type="spellEnd"/>
+      <w:r>
+        <w:rPr>
+          <w:rFonts w:ascii="Times New Roman" w:hAnsi="Times New Roman" w:cs="Times New Roman"/>
+          <w:sz w:val="24"/>
+          <w:szCs w:val="24"/>
+        </w:rPr>
+        <w:t xml:space="preserve"> practices, with continuous integration, continuous deployment, and continuous monitoring as the key capabilities of production ML systems. In the e-commerce forecasting case, </w:t>
+      </w:r>
+      <w:proofErr w:type="spellStart"/>
+      <w:r>
+        <w:rPr>
+          <w:rFonts w:ascii="Times New Roman" w:hAnsi="Times New Roman" w:cs="Times New Roman"/>
+          <w:sz w:val="24"/>
+          <w:szCs w:val="24"/>
+        </w:rPr>
+        <w:t>MLOps</w:t>
+      </w:r>
+      <w:proofErr w:type="spellEnd"/>
+      <w:r>
+        <w:rPr>
+          <w:rFonts w:ascii="Times New Roman" w:hAnsi="Times New Roman" w:cs="Times New Roman"/>
+          <w:sz w:val="24"/>
+          <w:szCs w:val="24"/>
+        </w:rPr>
+        <w:t xml:space="preserve"> can be used to perform automated retraining of models in reaction to data drift, which is a natural phenomenon as the market conditions and customer behavior change. </w:t>
+      </w:r>
+      <w:proofErr w:type="spellStart"/>
+      <w:r>
+        <w:rPr>
+          <w:rFonts w:ascii="Times New Roman" w:hAnsi="Times New Roman" w:cs="Times New Roman"/>
+          <w:sz w:val="24"/>
+          <w:szCs w:val="24"/>
+        </w:rPr>
+        <w:t>MLOps</w:t>
+      </w:r>
+      <w:proofErr w:type="spellEnd"/>
+      <w:r>
+        <w:rPr>
+          <w:rFonts w:ascii="Times New Roman" w:hAnsi="Times New Roman" w:cs="Times New Roman"/>
+          <w:sz w:val="24"/>
+          <w:szCs w:val="24"/>
+        </w:rPr>
+        <w:t xml:space="preserve"> and BI dashboard integration allow notifying stakeholders about the need to retrench models and their bad performance.</w:t>
+      </w:r>
+    </w:p>
+    <w:p>
+      <w:pPr>
+        <w:spacing w:line="360" w:lineRule="auto"/>
+        <w:jc w:val="both"/>
+        <w:rPr>
+          <w:rFonts w:ascii="Times New Roman" w:hAnsi="Times New Roman" w:cs="Times New Roman"/>
+          <w:b/>
+          <w:bCs/>
+          <w:sz w:val="24"/>
+          <w:szCs w:val="24"/>
+        </w:rPr>
+      </w:pPr>
+      <w:r>
+        <w:rPr>
+          <w:rFonts w:ascii="Times New Roman" w:hAnsi="Times New Roman" w:cs="Times New Roman"/>
+          <w:b/>
+          <w:bCs/>
+          <w:sz w:val="24"/>
+          <w:szCs w:val="24"/>
+        </w:rPr>
+        <w:t>2.6 Feature Engineering and Data Preparation</w:t>
+      </w:r>
+    </w:p>
+    <w:p>
+      <w:pPr>
+        <w:spacing w:line="360" w:lineRule="auto"/>
+        <w:jc w:val="both"/>
+        <w:rPr>
+          <w:rFonts w:ascii="Times New Roman" w:hAnsi="Times New Roman" w:cs="Times New Roman"/>
+          <w:sz w:val="24"/>
+          <w:szCs w:val="24"/>
+        </w:rPr>
+      </w:pPr>
+      <w:r>
+        <w:rPr>
+          <w:rFonts w:ascii="Times New Roman" w:hAnsi="Times New Roman" w:cs="Times New Roman"/>
+          <w:sz w:val="24"/>
+          <w:szCs w:val="24"/>
+        </w:rPr>
+        <w:t xml:space="preserve">Input features are very crucial to the functionality of ML models. Dawson [22] has shown that marketing mix variables are important in e-commerce forecasting by demonstrating that the model that uses advertising expenditure, social media interaction, and email campaign measurements have a great impact in comparison to models that are based on past history sales only. The paper </w:t>
       </w:r>
       <w:r>
         <w:rPr>
@@ -1385,371 +1934,30 @@
           <w:szCs w:val="24"/>
         </w:rPr>
         <w:lastRenderedPageBreak/>
-        <w:t>forecasting. The Transformer architecture, presented by Vaswani et al. [9] instead of recurrent connections substitutes them with self-attention mechanisms. To do sales forecasting Wu et al. [10] suggested the Informer model, which is quadratically simple, but offers long-sequence forecasting. These architectures provide the chance to represent short-term fluctuations and long-term dependencies at the same time.</w:t>
-      </w:r>
-    </w:p>
-    <w:p>
-      <w:pPr>
-        <w:spacing w:line="360" w:lineRule="auto"/>
-        <w:jc w:val="both"/>
-        <w:rPr>
-          <w:rFonts w:ascii="Times New Roman" w:hAnsi="Times New Roman" w:cs="Times New Roman"/>
-          <w:sz w:val="24"/>
-          <w:szCs w:val="24"/>
-        </w:rPr>
-      </w:pPr>
-      <w:r>
-        <w:rPr>
-          <w:rFonts w:ascii="Times New Roman" w:hAnsi="Times New Roman" w:cs="Times New Roman"/>
-          <w:sz w:val="24"/>
-          <w:szCs w:val="24"/>
-        </w:rPr>
-        <w:t>Bontempi et al. [11] came up with an algorithm form of integrating ARIMA and neural networks, with ARIMA representing the linear aspects and neural networks representing the non-linear trends in the residues. The experimental analysis of e-commerce data proved that this hybrid model can reduce the error rates compared to either technique. The modular architecture of the framework is also compatible with integrated BI-ML systems in which various components may be processed using distinct data streams.</w:t>
-      </w:r>
-    </w:p>
-    <w:p>
-      <w:pPr>
-        <w:spacing w:line="360" w:lineRule="auto"/>
-        <w:jc w:val="both"/>
-        <w:rPr>
-          <w:rFonts w:ascii="Times New Roman" w:hAnsi="Times New Roman" w:cs="Times New Roman"/>
-          <w:sz w:val="24"/>
-          <w:szCs w:val="24"/>
-        </w:rPr>
-      </w:pPr>
-      <w:r>
-        <w:rPr>
-          <w:rFonts w:ascii="Times New Roman" w:hAnsi="Times New Roman" w:cs="Times New Roman"/>
-          <w:sz w:val="24"/>
-          <w:szCs w:val="24"/>
-        </w:rPr>
-        <w:t>On the same note, Bandara et al. [12] presented a hybrid method that uses exponential smoothing and LSTM networks. The research established that exponential smoothing of the data to remove trend and seasonality was a significant performance enhancement of LSTM since this step enabled the neural network to concentrate on the more valuable non-linear association as opposed to underpinning temporal trends.</w:t>
-      </w:r>
-    </w:p>
-    <w:p>
-      <w:pPr>
-        <w:spacing w:line="360" w:lineRule="auto"/>
-        <w:jc w:val="both"/>
-        <w:rPr>
-          <w:rFonts w:ascii="Times New Roman" w:hAnsi="Times New Roman" w:cs="Times New Roman"/>
-          <w:sz w:val="24"/>
-          <w:szCs w:val="24"/>
-        </w:rPr>
-      </w:pPr>
-      <w:r>
-        <w:rPr>
-          <w:rFonts w:ascii="Times New Roman" w:hAnsi="Times New Roman" w:cs="Times New Roman"/>
-          <w:sz w:val="24"/>
-          <w:szCs w:val="24"/>
-        </w:rPr>
-        <w:t>Any BI system is based on the data architecture. Kimball and Ross [13] made the dimensional modeling approach the overall paradigm in the data warehousing. The star schema, which is made of fact tables which hold the quantitative values and dimension tables which hold the descriptive information, gives the business users an intuitive design but the query performance is achieved efficiently.</w:t>
-      </w:r>
-    </w:p>
-    <w:p>
-      <w:pPr>
-        <w:spacing w:line="360" w:lineRule="auto"/>
-        <w:jc w:val="both"/>
-        <w:rPr>
-          <w:rFonts w:ascii="Times New Roman" w:hAnsi="Times New Roman" w:cs="Times New Roman"/>
-          <w:sz w:val="24"/>
-          <w:szCs w:val="24"/>
-        </w:rPr>
-      </w:pPr>
-      <w:r>
-        <w:rPr>
-          <w:rFonts w:ascii="Times New Roman" w:hAnsi="Times New Roman" w:cs="Times New Roman"/>
-          <w:sz w:val="24"/>
-          <w:szCs w:val="24"/>
-        </w:rPr>
-        <w:t xml:space="preserve">In the case of e-commerce applications, there have arisen certain dimensional modeling patterns. The table of facts identified by </w:t>
-      </w:r>
-      <w:proofErr w:type="spellStart"/>
-      <w:r>
-        <w:rPr>
-          <w:rFonts w:ascii="Times New Roman" w:hAnsi="Times New Roman" w:cs="Times New Roman"/>
-          <w:sz w:val="24"/>
-          <w:szCs w:val="24"/>
-        </w:rPr>
-        <w:t>Golfarelli</w:t>
-      </w:r>
-      <w:proofErr w:type="spellEnd"/>
-      <w:r>
-        <w:rPr>
-          <w:rFonts w:ascii="Times New Roman" w:hAnsi="Times New Roman" w:cs="Times New Roman"/>
-          <w:sz w:val="24"/>
-          <w:szCs w:val="24"/>
-        </w:rPr>
-        <w:t xml:space="preserve"> and Rizzi [14] are sales transactions, movements and interacts with customers, and these dimensions are in turn divided into time, product, customer and channel. The authors have stressed that a properly built data warehouse is not just used to conduct reporting but also to provide an uncontaminated and coherent dataset to train the ML model which is considered a vital factor of integrated BI-ML systems.</w:t>
-      </w:r>
-    </w:p>
-    <w:p>
-      <w:pPr>
-        <w:spacing w:line="360" w:lineRule="auto"/>
-        <w:jc w:val="both"/>
-        <w:rPr>
-          <w:rFonts w:ascii="Times New Roman" w:hAnsi="Times New Roman" w:cs="Times New Roman"/>
-          <w:sz w:val="24"/>
-          <w:szCs w:val="24"/>
-        </w:rPr>
-      </w:pPr>
-      <w:r>
-        <w:rPr>
-          <w:rFonts w:ascii="Times New Roman" w:hAnsi="Times New Roman" w:cs="Times New Roman"/>
-          <w:sz w:val="24"/>
-          <w:szCs w:val="24"/>
-        </w:rPr>
-        <w:t xml:space="preserve">The most common interface of business stakeholders with BI systems is descriptive analytics, which is implemented using interactive dashboards. The design principles of effective dashboards were developed by Few et al. [15], since it is necessary to pay attention to such aspects of a good dashboard as visual hierarchy, contextual information, and actionable metrics. In the case of sales </w:t>
-      </w:r>
-      <w:r>
-        <w:rPr>
-          <w:rFonts w:ascii="Times New Roman" w:hAnsi="Times New Roman" w:cs="Times New Roman"/>
-          <w:sz w:val="24"/>
-          <w:szCs w:val="24"/>
-        </w:rPr>
-        <w:lastRenderedPageBreak/>
-        <w:t>forecasting applications, dashboards should not only show the values of the forecasts but also the uncertainty range and factors that contributes to making appropriate decisions.</w:t>
-      </w:r>
-    </w:p>
-    <w:p>
-      <w:pPr>
-        <w:spacing w:line="360" w:lineRule="auto"/>
-        <w:jc w:val="both"/>
-        <w:rPr>
-          <w:rFonts w:ascii="Times New Roman" w:hAnsi="Times New Roman" w:cs="Times New Roman"/>
-          <w:sz w:val="24"/>
-          <w:szCs w:val="24"/>
-        </w:rPr>
-      </w:pPr>
-      <w:r>
-        <w:rPr>
-          <w:rFonts w:ascii="Times New Roman" w:hAnsi="Times New Roman" w:cs="Times New Roman"/>
-          <w:sz w:val="24"/>
-          <w:szCs w:val="24"/>
-        </w:rPr>
-        <w:t>BI and ML systems integration have both technical and organizational challenges. The systematic literature review by Popovic et al. [16] into the business intelligence and analytics domain revealed that the gap between the descriptive and predictive analytics in the aspects of integration was one of the issues that remained constant. The authors suggested a maturity model in which organizations move to individual BI and ML implementations to combined systems with predictions entrenched in the BI dashboards and BI insights guiding the creation of features to the ML models.</w:t>
-      </w:r>
-    </w:p>
-    <w:p>
-      <w:pPr>
-        <w:spacing w:line="360" w:lineRule="auto"/>
-        <w:jc w:val="both"/>
-        <w:rPr>
-          <w:rFonts w:ascii="Times New Roman" w:hAnsi="Times New Roman" w:cs="Times New Roman"/>
-          <w:sz w:val="24"/>
-          <w:szCs w:val="24"/>
-        </w:rPr>
-      </w:pPr>
-      <w:r>
-        <w:rPr>
-          <w:rFonts w:ascii="Times New Roman" w:hAnsi="Times New Roman" w:cs="Times New Roman"/>
-          <w:sz w:val="24"/>
-          <w:szCs w:val="24"/>
-        </w:rPr>
-        <w:t>Apache Spark is a comprehensive engine of big data processing that is proposed by Zaharia et al. [17] and can be used to execute both BI workloads and ML workloads. This integrated architecture makes it easier to maintain a separate pipeline of reporting and modeling and therefore organizations have the capability of implementing integrated systems in a more cost-effective way. In the case of e-commerce applications, the fact that it is able to make use of streaming data to generate real-time features is an enormous plus.</w:t>
-      </w:r>
-    </w:p>
-    <w:p>
-      <w:pPr>
-        <w:spacing w:line="360" w:lineRule="auto"/>
-        <w:jc w:val="both"/>
-        <w:rPr>
-          <w:rFonts w:ascii="Times New Roman" w:hAnsi="Times New Roman" w:cs="Times New Roman"/>
-          <w:sz w:val="24"/>
-          <w:szCs w:val="24"/>
-        </w:rPr>
-      </w:pPr>
-      <w:r>
-        <w:rPr>
-          <w:rFonts w:ascii="Times New Roman" w:hAnsi="Times New Roman" w:cs="Times New Roman"/>
-          <w:sz w:val="24"/>
-          <w:szCs w:val="24"/>
-        </w:rPr>
-        <w:t>The essential complication in the implementation of ML alongside BI is the black box character of intricate models. Barredo Arrieta et al. [18] presented a taxonomy of explainable artificial intelligence (XAI) techniques in detail, differentiating between methods of intrinsically interpretable models and post-hoc explanation methods. In the case of BI dashboards that are required to assist in business decision-making, the authors highlighted that the explanations should be given in accordance with the technical capabilities of the stakeholder.</w:t>
-      </w:r>
-    </w:p>
-    <w:p>
-      <w:pPr>
-        <w:spacing w:line="360" w:lineRule="auto"/>
-        <w:jc w:val="both"/>
-        <w:rPr>
-          <w:rFonts w:ascii="Times New Roman" w:hAnsi="Times New Roman" w:cs="Times New Roman"/>
-          <w:sz w:val="24"/>
-          <w:szCs w:val="24"/>
-        </w:rPr>
-      </w:pPr>
-      <w:r>
-        <w:rPr>
-          <w:rFonts w:ascii="Times New Roman" w:hAnsi="Times New Roman" w:cs="Times New Roman"/>
-          <w:sz w:val="24"/>
-          <w:szCs w:val="24"/>
-        </w:rPr>
-        <w:t>Lundberg and Lee [19] came up with SHAP (</w:t>
-      </w:r>
-      <w:proofErr w:type="spellStart"/>
-      <w:r>
-        <w:rPr>
-          <w:rFonts w:ascii="Times New Roman" w:hAnsi="Times New Roman" w:cs="Times New Roman"/>
-          <w:sz w:val="24"/>
-          <w:szCs w:val="24"/>
-        </w:rPr>
-        <w:t>SHapley</w:t>
-      </w:r>
-      <w:proofErr w:type="spellEnd"/>
-      <w:r>
-        <w:rPr>
-          <w:rFonts w:ascii="Times New Roman" w:hAnsi="Times New Roman" w:cs="Times New Roman"/>
-          <w:sz w:val="24"/>
-          <w:szCs w:val="24"/>
-        </w:rPr>
-        <w:t xml:space="preserve"> Additive </w:t>
-      </w:r>
-      <w:proofErr w:type="spellStart"/>
-      <w:r>
-        <w:rPr>
-          <w:rFonts w:ascii="Times New Roman" w:hAnsi="Times New Roman" w:cs="Times New Roman"/>
-          <w:sz w:val="24"/>
-          <w:szCs w:val="24"/>
-        </w:rPr>
-        <w:t>exPlanations</w:t>
-      </w:r>
-      <w:proofErr w:type="spellEnd"/>
-      <w:r>
-        <w:rPr>
-          <w:rFonts w:ascii="Times New Roman" w:hAnsi="Times New Roman" w:cs="Times New Roman"/>
-          <w:sz w:val="24"/>
-          <w:szCs w:val="24"/>
-        </w:rPr>
-        <w:t>), a single framework of interpreting model predictions in terms of cooperative game theory. SHAP values break down predictions into feature contributions, which present consistent explanations that can be represented in BI dashboards. In the case of sales forecasting, SHAP explanations can determine whether a decrease in a forecast is caused by seasonality, price variation, or external variables that allow stakeholders to make the right decisions.</w:t>
-      </w:r>
-    </w:p>
-    <w:p>
-      <w:pPr>
-        <w:spacing w:line="360" w:lineRule="auto"/>
-        <w:jc w:val="both"/>
-        <w:rPr>
-          <w:rFonts w:ascii="Times New Roman" w:hAnsi="Times New Roman" w:cs="Times New Roman"/>
-          <w:sz w:val="24"/>
-          <w:szCs w:val="24"/>
-        </w:rPr>
-      </w:pPr>
-      <w:r>
-        <w:rPr>
-          <w:rFonts w:ascii="Times New Roman" w:hAnsi="Times New Roman" w:cs="Times New Roman"/>
-          <w:sz w:val="24"/>
-          <w:szCs w:val="24"/>
-        </w:rPr>
-        <w:t xml:space="preserve">Sculley et al. [20] pointed at the concept of the hidden technical debt of machine learning systems and suggested that the ML algorithm comprises of a very small part of the overall complexity of the system. The authors named data validation, feature management, and model monitoring as the most important elements that are frequently overlooked in research-oriented ML projects. In case </w:t>
-      </w:r>
-      <w:r>
-        <w:rPr>
-          <w:rFonts w:ascii="Times New Roman" w:hAnsi="Times New Roman" w:cs="Times New Roman"/>
-          <w:sz w:val="24"/>
-          <w:szCs w:val="24"/>
-        </w:rPr>
-        <w:lastRenderedPageBreak/>
-        <w:t>of integrated BI-ML systems, these factors are further enhanced by the requirement to ensure compatibility with particular BI infrastructure present.</w:t>
-      </w:r>
-    </w:p>
-    <w:p>
-      <w:pPr>
-        <w:spacing w:line="360" w:lineRule="auto"/>
-        <w:jc w:val="both"/>
-        <w:rPr>
-          <w:rFonts w:ascii="Times New Roman" w:hAnsi="Times New Roman" w:cs="Times New Roman"/>
-          <w:sz w:val="24"/>
-          <w:szCs w:val="24"/>
-        </w:rPr>
-      </w:pPr>
-      <w:proofErr w:type="spellStart"/>
-      <w:r>
-        <w:rPr>
-          <w:rFonts w:ascii="Times New Roman" w:hAnsi="Times New Roman" w:cs="Times New Roman"/>
-          <w:sz w:val="24"/>
-          <w:szCs w:val="24"/>
-        </w:rPr>
-        <w:t>Kreuzberger</w:t>
-      </w:r>
-      <w:proofErr w:type="spellEnd"/>
-      <w:r>
-        <w:rPr>
-          <w:rFonts w:ascii="Times New Roman" w:hAnsi="Times New Roman" w:cs="Times New Roman"/>
-          <w:sz w:val="24"/>
-          <w:szCs w:val="24"/>
-        </w:rPr>
-        <w:t xml:space="preserve"> et al. [21] offered a systemic overview of </w:t>
-      </w:r>
-      <w:proofErr w:type="spellStart"/>
-      <w:r>
-        <w:rPr>
-          <w:rFonts w:ascii="Times New Roman" w:hAnsi="Times New Roman" w:cs="Times New Roman"/>
-          <w:sz w:val="24"/>
-          <w:szCs w:val="24"/>
-        </w:rPr>
-        <w:t>MLOps</w:t>
-      </w:r>
-      <w:proofErr w:type="spellEnd"/>
-      <w:r>
-        <w:rPr>
-          <w:rFonts w:ascii="Times New Roman" w:hAnsi="Times New Roman" w:cs="Times New Roman"/>
-          <w:sz w:val="24"/>
-          <w:szCs w:val="24"/>
-        </w:rPr>
-        <w:t xml:space="preserve"> practices, with continuous integration, continuous deployment, and continuous monitoring as the key capabilities of production ML systems. In the e-commerce forecasting case, </w:t>
-      </w:r>
-      <w:proofErr w:type="spellStart"/>
-      <w:r>
-        <w:rPr>
-          <w:rFonts w:ascii="Times New Roman" w:hAnsi="Times New Roman" w:cs="Times New Roman"/>
-          <w:sz w:val="24"/>
-          <w:szCs w:val="24"/>
-        </w:rPr>
-        <w:t>MLOps</w:t>
-      </w:r>
-      <w:proofErr w:type="spellEnd"/>
-      <w:r>
-        <w:rPr>
-          <w:rFonts w:ascii="Times New Roman" w:hAnsi="Times New Roman" w:cs="Times New Roman"/>
-          <w:sz w:val="24"/>
-          <w:szCs w:val="24"/>
-        </w:rPr>
-        <w:t xml:space="preserve"> can be used to perform automated retraining of models in reaction to data drift, which is a natural phenomenon as the market conditions and customer behavior change. </w:t>
-      </w:r>
-      <w:proofErr w:type="spellStart"/>
-      <w:r>
-        <w:rPr>
-          <w:rFonts w:ascii="Times New Roman" w:hAnsi="Times New Roman" w:cs="Times New Roman"/>
-          <w:sz w:val="24"/>
-          <w:szCs w:val="24"/>
-        </w:rPr>
-        <w:t>MLOps</w:t>
-      </w:r>
-      <w:proofErr w:type="spellEnd"/>
-      <w:r>
-        <w:rPr>
-          <w:rFonts w:ascii="Times New Roman" w:hAnsi="Times New Roman" w:cs="Times New Roman"/>
-          <w:sz w:val="24"/>
-          <w:szCs w:val="24"/>
-        </w:rPr>
-        <w:t xml:space="preserve"> and BI dashboard integration allow notifying stakeholders about the need to retrench models and their bad performance.</w:t>
-      </w:r>
-    </w:p>
-    <w:p>
-      <w:pPr>
-        <w:spacing w:line="360" w:lineRule="auto"/>
-        <w:jc w:val="both"/>
-        <w:rPr>
-          <w:rFonts w:ascii="Times New Roman" w:hAnsi="Times New Roman" w:cs="Times New Roman"/>
-          <w:sz w:val="24"/>
-          <w:szCs w:val="24"/>
-        </w:rPr>
-      </w:pPr>
-      <w:r>
-        <w:rPr>
-          <w:rFonts w:ascii="Times New Roman" w:hAnsi="Times New Roman" w:cs="Times New Roman"/>
-          <w:sz w:val="24"/>
-          <w:szCs w:val="24"/>
-        </w:rPr>
-        <w:t>Input features are very crucial to the functionality of ML models. Dawson [22] has shown that marketing mix variables are important in e-commerce forecasting by demonstrating that the model that uses advertising expenditure, social media interaction, and email campaign measurements have a great impact in comparison to models that are based on past history sales only. The paper has pointed out that these marketing metrics are normally handled in BI systems, which explains the importance of integration.</w:t>
+        <w:t>has pointed out that these marketing metrics are normally handled in BI systems, which explains the importance of integration.</w:t>
+      </w:r>
+    </w:p>
+    <w:p>
+      <w:pPr>
+        <w:spacing w:line="360" w:lineRule="auto"/>
+        <w:jc w:val="both"/>
+        <w:rPr>
+          <w:rFonts w:ascii="Times New Roman" w:hAnsi="Times New Roman" w:cs="Times New Roman"/>
+          <w:b/>
+          <w:bCs/>
+          <w:sz w:val="24"/>
+          <w:szCs w:val="24"/>
+        </w:rPr>
+      </w:pPr>
+      <w:r>
+        <w:rPr>
+          <w:rFonts w:ascii="Times New Roman" w:hAnsi="Times New Roman" w:cs="Times New Roman"/>
+          <w:b/>
+          <w:bCs/>
+          <w:sz w:val="24"/>
+          <w:szCs w:val="24"/>
+        </w:rPr>
+        <w:t>2.7 Evaluation Frameworks and Metrics</w:t>
       </w:r>
     </w:p>
     <w:p>
@@ -1891,6 +2099,14 @@
         </w:rPr>
         <w:lastRenderedPageBreak/>
         <w:t>CHAPTER II</w:t>
+      </w:r>
+      <w:r>
+        <w:rPr>
+          <w:rFonts w:ascii="Times New Roman" w:eastAsia="Google Sans" w:hAnsi="Times New Roman" w:cs="Times New Roman"/>
+          <w:sz w:val="40"/>
+          <w:szCs w:val="40"/>
+        </w:rPr>
+        <w:t>I</w:t>
       </w:r>
     </w:p>
     <w:p>
@@ -2108,38 +2324,15 @@
           <w:sz w:val="24"/>
           <w:szCs w:val="24"/>
         </w:rPr>
-        <w:fldChar w:fldCharType="begin"/>
-      </w:r>
-      <w:r>
-        <w:rPr>
-          <w:rFonts w:asciiTheme="majorBidi" w:hAnsiTheme="majorBidi" w:cstheme="majorBidi"/>
-          <w:sz w:val="24"/>
-          <w:szCs w:val="24"/>
-        </w:rPr>
-        <w:instrText xml:space="preserve"> ADDIN ZOTERO_ITEM CSL_CITATION {"citationID":"c6tVtsNt","properties":{"unsorted":false,"formattedCitation":"(Kimball &amp; Ross, 2013)","plainCitation":"(Kimball &amp; Ross, 2013)","noteIndex":0},"citationItems":[{"id":14,"uris":["http://zotero.org/users/local/ZF6vXB9x/items/QUVGT9BW"],"itemData":{"id":14,"type":"book","call-number":"QA76.9.D26 K575 2013","edition":"Third edition","ISBN":"978-1-118-53080-1","number-of-pages":"564","publisher":"John Wiley &amp; Sons, Inc","publisher-place":"Indianapolis, IN","source":"Library of Congress ISBN","title":"The data warehouse toolkit: the definitive guide to dimensional modeling","title-short":"The data warehouse toolkit","author":[{"family":"Kimball","given":"Ralph"},{"family":"Ross","given":"Margy"}],"issued":{"date-parts":[["2013"]]}}}],"schema":"https://github.com/citation-style-language/schema/raw/master/csl-citation.json"} </w:instrText>
-      </w:r>
-      <w:r>
-        <w:rPr>
-          <w:rFonts w:asciiTheme="majorBidi" w:hAnsiTheme="majorBidi" w:cstheme="majorBidi"/>
-          <w:sz w:val="24"/>
-          <w:szCs w:val="24"/>
-        </w:rPr>
-        <w:fldChar w:fldCharType="separate"/>
-      </w:r>
-      <w:r>
-        <w:rPr>
-          <w:rFonts w:ascii="Cambria" w:hAnsi="Cambria"/>
-          <w:sz w:val="24"/>
-        </w:rPr>
-        <w:t>(Kimball &amp; Ross, 2013)</w:t>
-      </w:r>
-      <w:r>
-        <w:rPr>
-          <w:rFonts w:asciiTheme="majorBidi" w:hAnsiTheme="majorBidi" w:cstheme="majorBidi"/>
-          <w:sz w:val="24"/>
-          <w:szCs w:val="24"/>
-        </w:rPr>
-        <w:fldChar w:fldCharType="end"/>
+        <w:t xml:space="preserve"> </w:t>
+      </w:r>
+      <w:r>
+        <w:rPr>
+          <w:rFonts w:ascii="Times New Roman" w:hAnsi="Times New Roman" w:cs="Times New Roman"/>
+          <w:sz w:val="24"/>
+          <w:szCs w:val="24"/>
+        </w:rPr>
+        <w:t>[3]</w:t>
       </w:r>
       <w:r>
         <w:rPr>
@@ -2362,38 +2555,15 @@
           <w:sz w:val="24"/>
           <w:szCs w:val="24"/>
         </w:rPr>
-        <w:fldChar w:fldCharType="begin"/>
-      </w:r>
-      <w:r>
-        <w:rPr>
-          <w:rFonts w:asciiTheme="majorBidi" w:hAnsiTheme="majorBidi" w:cstheme="majorBidi"/>
-          <w:sz w:val="24"/>
-          <w:szCs w:val="24"/>
-        </w:rPr>
-        <w:instrText xml:space="preserve"> ADDIN ZOTERO_ITEM CSL_CITATION {"citationID":"PlLQOIVT","properties":{"unsorted":false,"formattedCitation":"(Kimball &amp; Ross, 2013)","plainCitation":"(Kimball &amp; Ross, 2013)","noteIndex":0},"citationItems":[{"id":14,"uris":["http://zotero.org/users/local/ZF6vXB9x/items/QUVGT9BW"],"itemData":{"id":14,"type":"book","call-number":"QA76.9.D26 K575 2013","edition":"Third edition","ISBN":"978-1-118-53080-1","number-of-pages":"564","publisher":"John Wiley &amp; Sons, Inc","publisher-place":"Indianapolis, IN","source":"Library of Congress ISBN","title":"The data warehouse toolkit: the definitive guide to dimensional modeling","title-short":"The data warehouse toolkit","author":[{"family":"Kimball","given":"Ralph"},{"family":"Ross","given":"Margy"}],"issued":{"date-parts":[["2013"]]}}}],"schema":"https://github.com/citation-style-language/schema/raw/master/csl-citation.json"} </w:instrText>
-      </w:r>
-      <w:r>
-        <w:rPr>
-          <w:rFonts w:asciiTheme="majorBidi" w:hAnsiTheme="majorBidi" w:cstheme="majorBidi"/>
-          <w:sz w:val="24"/>
-          <w:szCs w:val="24"/>
-        </w:rPr>
-        <w:fldChar w:fldCharType="separate"/>
-      </w:r>
-      <w:r>
-        <w:rPr>
-          <w:rFonts w:ascii="Cambria" w:hAnsi="Cambria"/>
-          <w:sz w:val="24"/>
-        </w:rPr>
-        <w:t>(Kimball &amp; Ross, 2013)</w:t>
-      </w:r>
-      <w:r>
-        <w:rPr>
-          <w:rFonts w:asciiTheme="majorBidi" w:hAnsiTheme="majorBidi" w:cstheme="majorBidi"/>
-          <w:sz w:val="24"/>
-          <w:szCs w:val="24"/>
-        </w:rPr>
-        <w:fldChar w:fldCharType="end"/>
+        <w:t xml:space="preserve"> </w:t>
+      </w:r>
+      <w:r>
+        <w:rPr>
+          <w:rFonts w:ascii="Times New Roman" w:hAnsi="Times New Roman" w:cs="Times New Roman"/>
+          <w:sz w:val="24"/>
+          <w:szCs w:val="24"/>
+        </w:rPr>
+        <w:t>[3]</w:t>
       </w:r>
       <w:r>
         <w:rPr>
@@ -2418,7 +2588,7 @@
     <w:p>
       <w:pPr>
         <w:spacing w:line="360" w:lineRule="auto"/>
-        <w:jc w:val="both"/>
+        <w:jc w:val="center"/>
         <w:rPr>
           <w:rFonts w:asciiTheme="majorBidi" w:hAnsiTheme="majorBidi" w:cstheme="majorBidi"/>
           <w:sz w:val="24"/>
@@ -2565,54 +2735,47 @@
           <w:szCs w:val="24"/>
         </w:rPr>
         <w:noBreakHyphen/>
-        <w:t>based star schema to support efficient analytical processing and predictive modeling. The schema organizes the cleaned and transformed dataset into a central fact table surrounded by dimension tables that provide contextual attributes.</w:t>
-      </w:r>
-      <w:r>
-        <w:rPr>
-          <w:rFonts w:asciiTheme="majorBidi" w:hAnsiTheme="majorBidi" w:cstheme="majorBidi"/>
-          <w:sz w:val="24"/>
-          <w:szCs w:val="24"/>
-        </w:rPr>
-        <w:fldChar w:fldCharType="begin"/>
-      </w:r>
-      <w:r>
-        <w:rPr>
-          <w:rFonts w:asciiTheme="majorBidi" w:hAnsiTheme="majorBidi" w:cstheme="majorBidi"/>
-          <w:sz w:val="24"/>
-          <w:szCs w:val="24"/>
-        </w:rPr>
-        <w:instrText xml:space="preserve"> ADDIN ZOTERO_ITEM CSL_CITATION {"citationID":"BJZd6ol9","properties":{"unsorted":false,"formattedCitation":"(Kimball &amp; Ross, 2013)","plainCitation":"(Kimball &amp; Ross, 2013)","noteIndex":0},"citationItems":[{"id":14,"uris":["http://zotero.org/users/local/ZF6vXB9x/items/QUVGT9BW"],"itemData":{"id":14,"type":"book","call-number":"QA76.9.D26 K575 2013","edition":"Third edition","ISBN":"978-1-118-53080-1","number-of-pages":"564","publisher":"John Wiley &amp; Sons, Inc","publisher-place":"Indianapolis, IN","source":"Library of Congress ISBN","title":"The data warehouse toolkit: the definitive guide to dimensional modeling","title-short":"The data warehouse toolkit","author":[{"family":"Kimball","given":"Ralph"},{"family":"Ross","given":"Margy"}],"issued":{"date-parts":[["2013"]]}}}],"schema":"https://github.com/citation-style-language/schema/raw/master/csl-citation.json"} </w:instrText>
-      </w:r>
-      <w:r>
-        <w:rPr>
-          <w:rFonts w:asciiTheme="majorBidi" w:hAnsiTheme="majorBidi" w:cstheme="majorBidi"/>
-          <w:sz w:val="24"/>
-          <w:szCs w:val="24"/>
-        </w:rPr>
-        <w:fldChar w:fldCharType="separate"/>
-      </w:r>
-      <w:r>
-        <w:rPr>
-          <w:rFonts w:ascii="Cambria" w:hAnsi="Cambria"/>
-          <w:sz w:val="24"/>
-        </w:rPr>
-        <w:t>(Kimball &amp; Ross, 2013)</w:t>
-      </w:r>
-      <w:r>
-        <w:rPr>
-          <w:rFonts w:asciiTheme="majorBidi" w:hAnsiTheme="majorBidi" w:cstheme="majorBidi"/>
-          <w:sz w:val="24"/>
-          <w:szCs w:val="24"/>
-        </w:rPr>
-        <w:fldChar w:fldCharType="end"/>
-      </w:r>
-      <w:r>
-        <w:rPr>
-          <w:rFonts w:asciiTheme="majorBidi" w:hAnsiTheme="majorBidi" w:cstheme="majorBidi"/>
-          <w:sz w:val="24"/>
-          <w:szCs w:val="24"/>
-        </w:rPr>
-        <w:t xml:space="preserve"> This structure enhances query performance, reduces redundancy, and aligns with established data warehousing principles used in business intelligence systems.</w:t>
+        <w:t xml:space="preserve">based star schema to support efficient analytical processing and predictive modeling. The schema organizes the cleaned and transformed dataset into a central fact table surrounded by dimension tables that provide contextual </w:t>
+      </w:r>
+      <w:r>
+        <w:rPr>
+          <w:rFonts w:asciiTheme="majorBidi" w:hAnsiTheme="majorBidi" w:cstheme="majorBidi"/>
+          <w:sz w:val="24"/>
+          <w:szCs w:val="24"/>
+        </w:rPr>
+        <w:t>attributes</w:t>
+      </w:r>
+      <w:r>
+        <w:rPr>
+          <w:rFonts w:ascii="Times New Roman" w:hAnsi="Times New Roman" w:cs="Times New Roman"/>
+          <w:sz w:val="24"/>
+          <w:szCs w:val="24"/>
+        </w:rPr>
+        <w:t xml:space="preserve"> [3]</w:t>
+      </w:r>
+      <w:r>
+        <w:rPr>
+          <w:rFonts w:ascii="Times New Roman" w:hAnsi="Times New Roman" w:cs="Times New Roman"/>
+          <w:sz w:val="24"/>
+          <w:szCs w:val="24"/>
+        </w:rPr>
+        <w:t>.</w:t>
+      </w:r>
+      <w:r>
+        <w:rPr>
+          <w:rFonts w:ascii="Times New Roman" w:hAnsi="Times New Roman" w:cs="Times New Roman"/>
+          <w:sz w:val="24"/>
+          <w:szCs w:val="24"/>
+        </w:rPr>
+        <w:t xml:space="preserve"> </w:t>
+      </w:r>
+      <w:r>
+        <w:rPr>
+          <w:rFonts w:asciiTheme="majorBidi" w:hAnsiTheme="majorBidi" w:cstheme="majorBidi"/>
+          <w:sz w:val="24"/>
+          <w:szCs w:val="24"/>
+        </w:rPr>
+        <w:t>This structure enhances query performance, reduces redundancy, and aligns with established data warehousing principles used in business intelligence systems.</w:t>
       </w:r>
     </w:p>
     <w:p>
@@ -2732,63 +2895,56 @@
           <w:szCs w:val="24"/>
         </w:rPr>
         <w:noBreakHyphen/>
-        <w:t>ready foundation that supports both traditional BI reporting and advanced predictive analytics.</w:t>
-      </w:r>
-      <w:r>
-        <w:rPr>
-          <w:rFonts w:asciiTheme="majorBidi" w:hAnsiTheme="majorBidi" w:cstheme="majorBidi"/>
-          <w:sz w:val="24"/>
-          <w:szCs w:val="24"/>
-        </w:rPr>
-        <w:fldChar w:fldCharType="begin"/>
-      </w:r>
-      <w:r>
-        <w:rPr>
-          <w:rFonts w:asciiTheme="majorBidi" w:hAnsiTheme="majorBidi" w:cstheme="majorBidi"/>
-          <w:sz w:val="24"/>
-          <w:szCs w:val="24"/>
-        </w:rPr>
-        <w:instrText xml:space="preserve"> ADDIN ZOTERO_ITEM CSL_CITATION {"citationID":"5N3ZUP5M","properties":{"unsorted":false,"formattedCitation":"(Kimball &amp; Ross, 2013)","plainCitation":"(Kimball &amp; Ross, 2013)","noteIndex":0},"citationItems":[{"id":14,"uris":["http://zotero.org/users/local/ZF6vXB9x/items/QUVGT9BW"],"itemData":{"id":14,"type":"book","call-number":"QA76.9.D26 K575 2013","edition":"Third edition","ISBN":"978-1-118-53080-1","number-of-pages":"564","publisher":"John Wiley &amp; Sons, Inc","publisher-place":"Indianapolis, IN","source":"Library of Congress ISBN","title":"The data warehouse toolkit: the definitive guide to dimensional modeling","title-short":"The data warehouse toolkit","author":[{"family":"Kimball","given":"Ralph"},{"family":"Ross","given":"Margy"}],"issued":{"date-parts":[["2013"]]}}}],"schema":"https://github.com/citation-style-language/schema/raw/master/csl-citation.json"} </w:instrText>
-      </w:r>
-      <w:r>
-        <w:rPr>
-          <w:rFonts w:asciiTheme="majorBidi" w:hAnsiTheme="majorBidi" w:cstheme="majorBidi"/>
-          <w:sz w:val="24"/>
-          <w:szCs w:val="24"/>
-        </w:rPr>
-        <w:fldChar w:fldCharType="separate"/>
-      </w:r>
-      <w:r>
-        <w:rPr>
-          <w:rFonts w:ascii="Cambria" w:hAnsi="Cambria"/>
-          <w:sz w:val="24"/>
-        </w:rPr>
-        <w:t>(Kimball &amp; Ross, 2013)</w:t>
-      </w:r>
-      <w:r>
-        <w:rPr>
-          <w:rFonts w:asciiTheme="majorBidi" w:hAnsiTheme="majorBidi" w:cstheme="majorBidi"/>
-          <w:sz w:val="24"/>
-          <w:szCs w:val="24"/>
-        </w:rPr>
-        <w:fldChar w:fldCharType="end"/>
-      </w:r>
-    </w:p>
-    <w:p>
-      <w:pPr>
-        <w:spacing w:line="360" w:lineRule="auto"/>
-        <w:jc w:val="both"/>
-        <w:rPr>
-          <w:rFonts w:asciiTheme="majorBidi" w:hAnsiTheme="majorBidi" w:cstheme="majorBidi"/>
-          <w:sz w:val="24"/>
-          <w:szCs w:val="24"/>
-        </w:rPr>
-      </w:pPr>
-    </w:p>
-    <w:p>
-      <w:pPr>
-        <w:spacing w:line="360" w:lineRule="auto"/>
-        <w:jc w:val="both"/>
+        <w:t>ready foundation that supports both traditional BI reporting and advanced predictive analytics</w:t>
+      </w:r>
+      <w:r>
+        <w:rPr>
+          <w:rFonts w:asciiTheme="majorBidi" w:hAnsiTheme="majorBidi" w:cstheme="majorBidi"/>
+          <w:sz w:val="24"/>
+          <w:szCs w:val="24"/>
+        </w:rPr>
+        <w:t xml:space="preserve"> </w:t>
+      </w:r>
+      <w:r>
+        <w:rPr>
+          <w:rFonts w:ascii="Times New Roman" w:hAnsi="Times New Roman" w:cs="Times New Roman"/>
+          <w:sz w:val="24"/>
+          <w:szCs w:val="24"/>
+        </w:rPr>
+        <w:t>[3]</w:t>
+      </w:r>
+      <w:r>
+        <w:rPr>
+          <w:rFonts w:ascii="Times New Roman" w:hAnsi="Times New Roman" w:cs="Times New Roman"/>
+          <w:sz w:val="24"/>
+          <w:szCs w:val="24"/>
+        </w:rPr>
+        <w:t>.</w:t>
+      </w:r>
+      <w:r>
+        <w:rPr>
+          <w:rFonts w:asciiTheme="majorBidi" w:hAnsiTheme="majorBidi" w:cstheme="majorBidi"/>
+          <w:sz w:val="24"/>
+          <w:szCs w:val="24"/>
+        </w:rPr>
+        <w:t xml:space="preserve"> </w:t>
+      </w:r>
+    </w:p>
+    <w:p>
+      <w:pPr>
+        <w:spacing w:line="360" w:lineRule="auto"/>
+        <w:jc w:val="both"/>
+        <w:rPr>
+          <w:rFonts w:asciiTheme="majorBidi" w:hAnsiTheme="majorBidi" w:cstheme="majorBidi"/>
+          <w:sz w:val="24"/>
+          <w:szCs w:val="24"/>
+        </w:rPr>
+      </w:pPr>
+    </w:p>
+    <w:p>
+      <w:pPr>
+        <w:spacing w:line="360" w:lineRule="auto"/>
+        <w:jc w:val="center"/>
         <w:rPr>
           <w:rFonts w:asciiTheme="majorBidi" w:hAnsiTheme="majorBidi" w:cstheme="majorBidi"/>
           <w:sz w:val="24"/>
@@ -2802,17 +2958,9 @@
         </w:rPr>
         <w:lastRenderedPageBreak/>
         <w:drawing>
-          <wp:anchor distT="0" distB="0" distL="114300" distR="114300" simplePos="0" relativeHeight="251658240" behindDoc="1" locked="0" layoutInCell="1" allowOverlap="1" wp14:anchorId="3CAB100F" wp14:editId="0D712FB7">
-            <wp:simplePos x="0" y="0"/>
-            <wp:positionH relativeFrom="column">
-              <wp:posOffset>1333500</wp:posOffset>
-            </wp:positionH>
-            <wp:positionV relativeFrom="paragraph">
-              <wp:posOffset>-76200</wp:posOffset>
-            </wp:positionV>
-            <wp:extent cx="2809240" cy="1864360"/>
-            <wp:effectExtent l="0" t="0" r="0" b="2540"/>
-            <wp:wrapTopAndBottom/>
+          <wp:inline distT="0" distB="0" distL="0" distR="0" wp14:anchorId="3CAB100F" wp14:editId="2A1A0CA7">
+            <wp:extent cx="3310255" cy="2197100"/>
+            <wp:effectExtent l="0" t="0" r="4445" b="0"/>
             <wp:docPr id="3" name="Picture 3"/>
             <wp:cNvGraphicFramePr>
               <a:graphicFrameLocks xmlns:a="http://schemas.openxmlformats.org/drawingml/2006/main" noChangeAspect="1"/>
@@ -2842,7 +2990,7 @@
                   <pic:spPr bwMode="auto">
                     <a:xfrm>
                       <a:off x="0" y="0"/>
-                      <a:ext cx="2809240" cy="1864360"/>
+                      <a:ext cx="3310255" cy="2197100"/>
                     </a:xfrm>
                     <a:prstGeom prst="rect">
                       <a:avLst/>
@@ -2852,22 +3000,27 @@
                 </pic:pic>
               </a:graphicData>
             </a:graphic>
-            <wp14:sizeRelH relativeFrom="page">
-              <wp14:pctWidth>0</wp14:pctWidth>
-            </wp14:sizeRelH>
-            <wp14:sizeRelV relativeFrom="page">
-              <wp14:pctHeight>0</wp14:pctHeight>
-            </wp14:sizeRelV>
-          </wp:anchor>
+          </wp:inline>
         </w:drawing>
       </w:r>
-      <w:r>
-        <w:rPr>
-          <w:rFonts w:asciiTheme="majorBidi" w:hAnsiTheme="majorBidi" w:cstheme="majorBidi"/>
-          <w:sz w:val="24"/>
-          <w:szCs w:val="24"/>
-        </w:rPr>
-        <w:t xml:space="preserve">                                             Fig 3.5.1 Data Warehouse Schema</w:t>
+    </w:p>
+    <w:p>
+      <w:pPr>
+        <w:spacing w:line="360" w:lineRule="auto"/>
+        <w:jc w:val="center"/>
+        <w:rPr>
+          <w:rFonts w:asciiTheme="majorBidi" w:hAnsiTheme="majorBidi" w:cstheme="majorBidi"/>
+          <w:sz w:val="24"/>
+          <w:szCs w:val="24"/>
+        </w:rPr>
+      </w:pPr>
+      <w:r>
+        <w:rPr>
+          <w:rFonts w:asciiTheme="majorBidi" w:hAnsiTheme="majorBidi" w:cstheme="majorBidi"/>
+          <w:sz w:val="24"/>
+          <w:szCs w:val="24"/>
+        </w:rPr>
+        <w:t>Fig 3.5.1 Data Warehouse Schema</w:t>
       </w:r>
     </w:p>
     <w:p>
@@ -2945,23 +3098,7 @@
           <w:rFonts w:ascii="Cambria" w:hAnsi="Cambria"/>
           <w:sz w:val="24"/>
         </w:rPr>
-        <w:t>(</w:t>
-      </w:r>
-      <w:proofErr w:type="spellStart"/>
-      <w:r>
-        <w:rPr>
-          <w:rFonts w:ascii="Cambria" w:hAnsi="Cambria"/>
-          <w:sz w:val="24"/>
-        </w:rPr>
-        <w:t>Suryawanshi</w:t>
-      </w:r>
-      <w:proofErr w:type="spellEnd"/>
-      <w:r>
-        <w:rPr>
-          <w:rFonts w:ascii="Cambria" w:hAnsi="Cambria"/>
-          <w:sz w:val="24"/>
-        </w:rPr>
-        <w:t xml:space="preserve"> et al., 2024)</w:t>
+        <w:t>(Suryawanshi et al., 2024)</w:t>
       </w:r>
       <w:r>
         <w:rPr>
@@ -3279,7 +3416,16 @@
           <w:sz w:val="24"/>
           <w:szCs w:val="24"/>
         </w:rPr>
-        <w:t>These features help the model recognize seasonal tendencies, momentum effects, and cyclical variations that single</w:t>
+        <w:t xml:space="preserve">These features help the model recognize seasonal tendencies, momentum effects, and cyclical </w:t>
+      </w:r>
+      <w:r>
+        <w:rPr>
+          <w:rFonts w:asciiTheme="majorBidi" w:hAnsiTheme="majorBidi" w:cstheme="majorBidi"/>
+          <w:sz w:val="24"/>
+          <w:szCs w:val="24"/>
+        </w:rPr>
+        <w:lastRenderedPageBreak/>
+        <w:t>variations that single</w:t>
       </w:r>
       <w:r>
         <w:rPr>
@@ -3288,16 +3434,7 @@
           <w:szCs w:val="24"/>
         </w:rPr>
         <w:noBreakHyphen/>
-        <w:t xml:space="preserve">week values may not adequately reflect. Other rolling statistics, such as rolling minimums, maximums, and standard deviations, may also be derived to characterize </w:t>
-      </w:r>
-      <w:r>
-        <w:rPr>
-          <w:rFonts w:asciiTheme="majorBidi" w:hAnsiTheme="majorBidi" w:cstheme="majorBidi"/>
-          <w:sz w:val="24"/>
-          <w:szCs w:val="24"/>
-        </w:rPr>
-        <w:lastRenderedPageBreak/>
-        <w:t>volatility, though only the most relevant features were retained to avoid overfitting.</w:t>
+        <w:t>week values may not adequately reflect. Other rolling statistics, such as rolling minimums, maximums, and standard deviations, may also be derived to characterize volatility, though only the most relevant features were retained to avoid overfitting.</w:t>
       </w:r>
     </w:p>
     <w:p>
@@ -3395,23 +3532,150 @@
           <w:rFonts w:ascii="Cambria" w:hAnsi="Cambria"/>
           <w:sz w:val="24"/>
         </w:rPr>
-        <w:t>(</w:t>
-      </w:r>
-      <w:proofErr w:type="spellStart"/>
+        <w:t>(Suryawanshi et al., 2024)</w:t>
+      </w:r>
+      <w:r>
+        <w:rPr>
+          <w:rFonts w:asciiTheme="majorBidi" w:hAnsiTheme="majorBidi" w:cstheme="majorBidi"/>
+          <w:sz w:val="24"/>
+          <w:szCs w:val="24"/>
+        </w:rPr>
+        <w:fldChar w:fldCharType="end"/>
+      </w:r>
+      <w:r>
+        <w:rPr>
+          <w:rFonts w:asciiTheme="majorBidi" w:hAnsiTheme="majorBidi" w:cstheme="majorBidi"/>
+          <w:sz w:val="24"/>
+          <w:szCs w:val="24"/>
+        </w:rPr>
+        <w:t xml:space="preserve"> Several algorithms are suitable for sales forecasting, each with different strengths depending on the structure and complexity of the data. Once the algorithm is chosen, the model is trained using the prepared dataset.</w:t>
+      </w:r>
+      <w:r>
+        <w:rPr>
+          <w:rFonts w:asciiTheme="majorBidi" w:hAnsiTheme="majorBidi" w:cstheme="majorBidi"/>
+          <w:sz w:val="24"/>
+          <w:szCs w:val="24"/>
+        </w:rPr>
+        <w:fldChar w:fldCharType="begin"/>
+      </w:r>
+      <w:r>
+        <w:rPr>
+          <w:rFonts w:asciiTheme="majorBidi" w:hAnsiTheme="majorBidi" w:cstheme="majorBidi"/>
+          <w:sz w:val="24"/>
+          <w:szCs w:val="24"/>
+        </w:rPr>
+        <w:instrText xml:space="preserve"> ADDIN ZOTERO_ITEM CSL_CITATION {"citationID":"sSmW8r5g","properties":{"unsorted":false,"formattedCitation":"(Suryawanshi et al., 2024)","plainCitation":"(Suryawanshi et al., 2024)","noteIndex":0},"citationItems":[{"id":3,"uris":["http://zotero.org/users/local/ZF6vXB9x/items/2JDNLTRJ"],"itemData":{"id":3,"type":"paper-conference","abstract":"In the dynamic world of business, accurate sales forecasting plays a pivotal role in shaping organizational strategies, optimizing resources, and staying ahead of thecompetition. The traditional methods of sales forecasting,though reliable to some extent, often fall short in capturing the complexities of modern markets. This paper delves into the realm of \"Sales Forecast Prediction Using MachineLearning,\" a cuttingedge approach that harnesses the power of data-driven algorithms to revolutionize sales forecasting. This paper presents a comprehensive exploration ofthe methodology, techniques, and challenges associated with leveraging machine learning for sales forecasting. Through a detailed literature review, this paper provides context by comparing traditional forecasting methods with machine learning, discussing various ML algorithms, data sources, and model evaluation metrics. Real-world case studies and applications underscore the practical benefits of this approach across different industries, from retail to supply chain management. Challenges and limitations are not overlooked, as the need for high-quality data, the risk of overfitting, and the interpretability of models are addressed. Furthermore, the report explores emerging trends and future research directions, emphasizing the ever-evolving landscape of sales forecast prediction using ML. It encompasses data collection, data preprocessing, featureengineering, model selection, training, validation, and deployment, resulting in a holistic framework for accurate sales predictions.","container-title":"2024 Intelligent Systems and Machine Learning Conference (ISML)","DOI":"10.1109/ISML60050.2024.11007449","event-title":"2024 Intelligent Systems and Machine Learning Conference (ISML)","ISBN":"979-8-3503-4387-8","language":"en","license":"https://doi.org/10.15223/policy-029","page":"745-750","publisher":"IEEE","publisher-place":"Hyderabad, India","source":"DOI.org (Crossref)","title":"Sales Forecast Prediction Using Machine Learning","URL":"https://ieeexplore.ieee.org/document/11007449/","author":[{"family":"Suryawanshi","given":"Vaibhav"},{"family":"Venkatesan","given":"Mithra"},{"family":"Chate","given":"Shubhangi"},{"family":"Amane","given":"Srishti"},{"family":"Bhondekar","given":"Anchal"},{"family":"Mulani","given":"Farzin"}],"accessed":{"date-parts":[["2026",3,3]]},"issued":{"date-parts":[["2024",5,4]]}}}],"schema":"https://github.com/citation-style-language/schema/raw/master/csl-citation.json"} </w:instrText>
+      </w:r>
+      <w:r>
+        <w:rPr>
+          <w:rFonts w:asciiTheme="majorBidi" w:hAnsiTheme="majorBidi" w:cstheme="majorBidi"/>
+          <w:sz w:val="24"/>
+          <w:szCs w:val="24"/>
+        </w:rPr>
+        <w:fldChar w:fldCharType="separate"/>
+      </w:r>
       <w:r>
         <w:rPr>
           <w:rFonts w:ascii="Cambria" w:hAnsi="Cambria"/>
           <w:sz w:val="24"/>
         </w:rPr>
-        <w:t>Suryawanshi</w:t>
-      </w:r>
-      <w:proofErr w:type="spellEnd"/>
+        <w:t>(Suryawanshi et al., 2024)</w:t>
+      </w:r>
+      <w:r>
+        <w:rPr>
+          <w:rFonts w:asciiTheme="majorBidi" w:hAnsiTheme="majorBidi" w:cstheme="majorBidi"/>
+          <w:sz w:val="24"/>
+          <w:szCs w:val="24"/>
+        </w:rPr>
+        <w:fldChar w:fldCharType="end"/>
+      </w:r>
+      <w:r>
+        <w:rPr>
+          <w:rFonts w:asciiTheme="majorBidi" w:hAnsiTheme="majorBidi" w:cstheme="majorBidi"/>
+          <w:sz w:val="24"/>
+          <w:szCs w:val="24"/>
+        </w:rPr>
+        <w:t xml:space="preserve"> During training, the engineered features are supplied to the algorithm, enabling it to learn the relationship between these inputs and the corresponding weekly sales values.</w:t>
+      </w:r>
+    </w:p>
+    <w:p>
+      <w:pPr>
+        <w:spacing w:line="360" w:lineRule="auto"/>
+        <w:rPr>
+          <w:rFonts w:asciiTheme="majorBidi" w:hAnsiTheme="majorBidi" w:cstheme="majorBidi"/>
+          <w:sz w:val="24"/>
+          <w:szCs w:val="24"/>
+        </w:rPr>
+      </w:pPr>
+      <w:r>
+        <w:rPr>
+          <w:rFonts w:asciiTheme="majorBidi" w:hAnsiTheme="majorBidi" w:cstheme="majorBidi"/>
+          <w:sz w:val="24"/>
+          <w:szCs w:val="24"/>
+        </w:rPr>
+        <w:t>In this study, three algorithms were implemented:</w:t>
+      </w:r>
+    </w:p>
+    <w:p>
+      <w:pPr>
+        <w:widowControl/>
+        <w:spacing w:line="360" w:lineRule="auto"/>
+        <w:ind w:left="360"/>
+        <w:jc w:val="both"/>
+        <w:rPr>
+          <w:rFonts w:asciiTheme="majorBidi" w:hAnsiTheme="majorBidi" w:cstheme="majorBidi"/>
+          <w:sz w:val="24"/>
+          <w:szCs w:val="24"/>
+        </w:rPr>
+      </w:pPr>
+      <w:r>
+        <w:rPr>
+          <w:rFonts w:asciiTheme="majorBidi" w:hAnsiTheme="majorBidi" w:cstheme="majorBidi"/>
+          <w:b/>
+          <w:bCs/>
+          <w:sz w:val="24"/>
+          <w:szCs w:val="24"/>
+        </w:rPr>
+        <w:t>Linear Regression</w:t>
+      </w:r>
+      <w:r>
+        <w:rPr>
+          <w:rFonts w:asciiTheme="majorBidi" w:hAnsiTheme="majorBidi" w:cstheme="majorBidi"/>
+          <w:sz w:val="24"/>
+          <w:szCs w:val="24"/>
+        </w:rPr>
+        <w:t>, which models the relationship between features and sales through a linear function.</w:t>
+      </w:r>
+      <w:r>
+        <w:rPr>
+          <w:rFonts w:asciiTheme="majorBidi" w:hAnsiTheme="majorBidi" w:cstheme="majorBidi"/>
+          <w:sz w:val="24"/>
+          <w:szCs w:val="24"/>
+        </w:rPr>
+        <w:fldChar w:fldCharType="begin"/>
+      </w:r>
+      <w:r>
+        <w:rPr>
+          <w:rFonts w:asciiTheme="majorBidi" w:hAnsiTheme="majorBidi" w:cstheme="majorBidi"/>
+          <w:sz w:val="24"/>
+          <w:szCs w:val="24"/>
+        </w:rPr>
+        <w:instrText xml:space="preserve"> ADDIN ZOTERO_ITEM CSL_CITATION {"citationID":"0zdWNT4i","properties":{"unsorted":false,"formattedCitation":"(Pedregosa et al., n.d.)","plainCitation":"(Pedregosa et al., n.d.)","noteIndex":0},"citationItems":[{"id":13,"uris":["http://zotero.org/users/local/ZF6vXB9x/items/R4PY5MMF"],"itemData":{"id":13,"type":"article-journal","abstract":"Scikit-learn is a Python module integrating a wide range of state-of-the-art machine learning algorithms for medium-scale supervised and unsupervised problems. This package focuses on bringing machine learning to non-specialists using a general-purpose high-level language. Emphasis is put on ease of use, performance, documentation, and API consistency. It has minimal dependencies and is distributed under the simpliﬁed BSD license, encouraging its use in both academic and commercial settings. Source code, binaries, and documentation can be downloaded from http://scikit-learn.sourceforge.net.","container-title":"MACHINE LEARNING IN PYTHON","language":"en","source":"Zotero","title":"Scikit-learn: Machine Learning in Python","author":[{"family":"Pedregosa","given":"Fabian"},{"family":"Pedregosa","given":"Fabian"},{"family":"Varoquaux","given":"Gael"},{"family":"Varoquaux","given":"Gael"},{"family":"Org","given":"Normalesup"},{"family":"Gramfort","given":"Alexandre"},{"family":"Gramfort","given":"Alexandre"},{"family":"Michel","given":"Vincent"},{"family":"Michel","given":"Vincent"},{"family":"Fr","given":"Logilab"},{"family":"Thirion","given":"Bertrand"},{"family":"Thirion","given":"Bertrand"},{"family":"Grisel","given":"Olivier"},{"family":"Grisel","given":"Olivier"},{"family":"Blondel","given":"Mathieu"},{"family":"Prettenhofer","given":"Peter"},{"family":"Prettenhofer","given":"Peter"},{"family":"Weiss","given":"Ron"},{"family":"Dubourg","given":"Vincent"},{"family":"Dubourg","given":"Vincent"},{"family":"Vanderplas","given":"Jake"},{"family":"Passos","given":"Alexandre"},{"family":"Tp","given":"Alexandre"},{"family":"Cournapeau","given":"David"}]}}],"schema":"https://github.com/citation-style-language/schema/raw/master/csl-citation.json"} </w:instrText>
+      </w:r>
+      <w:r>
+        <w:rPr>
+          <w:rFonts w:asciiTheme="majorBidi" w:hAnsiTheme="majorBidi" w:cstheme="majorBidi"/>
+          <w:sz w:val="24"/>
+          <w:szCs w:val="24"/>
+        </w:rPr>
+        <w:fldChar w:fldCharType="separate"/>
+      </w:r>
       <w:r>
         <w:rPr>
           <w:rFonts w:ascii="Cambria" w:hAnsi="Cambria"/>
           <w:sz w:val="24"/>
         </w:rPr>
-        <w:t xml:space="preserve"> et al., 2024)</w:t>
+        <w:t>(Pedregosa et al., n.d.)</w:t>
       </w:r>
       <w:r>
         <w:rPr>
@@ -3421,183 +3685,36 @@
         </w:rPr>
         <w:fldChar w:fldCharType="end"/>
       </w:r>
-      <w:r>
-        <w:rPr>
-          <w:rFonts w:asciiTheme="majorBidi" w:hAnsiTheme="majorBidi" w:cstheme="majorBidi"/>
-          <w:sz w:val="24"/>
-          <w:szCs w:val="24"/>
-        </w:rPr>
-        <w:t xml:space="preserve"> Several algorithms are suitable for sales forecasting, each with different strengths depending on the structure and complexity of the data. Once the algorithm is chosen, the model is trained using the prepared dataset.</w:t>
-      </w:r>
-      <w:r>
-        <w:rPr>
-          <w:rFonts w:asciiTheme="majorBidi" w:hAnsiTheme="majorBidi" w:cstheme="majorBidi"/>
-          <w:sz w:val="24"/>
-          <w:szCs w:val="24"/>
-        </w:rPr>
-        <w:fldChar w:fldCharType="begin"/>
-      </w:r>
-      <w:r>
-        <w:rPr>
-          <w:rFonts w:asciiTheme="majorBidi" w:hAnsiTheme="majorBidi" w:cstheme="majorBidi"/>
-          <w:sz w:val="24"/>
-          <w:szCs w:val="24"/>
-        </w:rPr>
-        <w:instrText xml:space="preserve"> ADDIN ZOTERO_ITEM CSL_CITATION {"citationID":"sSmW8r5g","properties":{"unsorted":false,"formattedCitation":"(Suryawanshi et al., 2024)","plainCitation":"(Suryawanshi et al., 2024)","noteIndex":0},"citationItems":[{"id":3,"uris":["http://zotero.org/users/local/ZF6vXB9x/items/2JDNLTRJ"],"itemData":{"id":3,"type":"paper-conference","abstract":"In the dynamic world of business, accurate sales forecasting plays a pivotal role in shaping organizational strategies, optimizing resources, and staying ahead of thecompetition. The traditional methods of sales forecasting,though reliable to some extent, often fall short in capturing the complexities of modern markets. This paper delves into the realm of \"Sales Forecast Prediction Using MachineLearning,\" a cuttingedge approach that harnesses the power of data-driven algorithms to revolutionize sales forecasting. This paper presents a comprehensive exploration ofthe methodology, techniques, and challenges associated with leveraging machine learning for sales forecasting. Through a detailed literature review, this paper provides context by comparing traditional forecasting methods with machine learning, discussing various ML algorithms, data sources, and model evaluation metrics. Real-world case studies and applications underscore the practical benefits of this approach across different industries, from retail to supply chain management. Challenges and limitations are not overlooked, as the need for high-quality data, the risk of overfitting, and the interpretability of models are addressed. Furthermore, the report explores emerging trends and future research directions, emphasizing the ever-evolving landscape of sales forecast prediction using ML. It encompasses data collection, data preprocessing, featureengineering, model selection, training, validation, and deployment, resulting in a holistic framework for accurate sales predictions.","container-title":"2024 Intelligent Systems and Machine Learning Conference (ISML)","DOI":"10.1109/ISML60050.2024.11007449","event-title":"2024 Intelligent Systems and Machine Learning Conference (ISML)","ISBN":"979-8-3503-4387-8","language":"en","license":"https://doi.org/10.15223/policy-029","page":"745-750","publisher":"IEEE","publisher-place":"Hyderabad, India","source":"DOI.org (Crossref)","title":"Sales Forecast Prediction Using Machine Learning","URL":"https://ieeexplore.ieee.org/document/11007449/","author":[{"family":"Suryawanshi","given":"Vaibhav"},{"family":"Venkatesan","given":"Mithra"},{"family":"Chate","given":"Shubhangi"},{"family":"Amane","given":"Srishti"},{"family":"Bhondekar","given":"Anchal"},{"family":"Mulani","given":"Farzin"}],"accessed":{"date-parts":[["2026",3,3]]},"issued":{"date-parts":[["2024",5,4]]}}}],"schema":"https://github.com/citation-style-language/schema/raw/master/csl-citation.json"} </w:instrText>
-      </w:r>
-      <w:r>
-        <w:rPr>
-          <w:rFonts w:asciiTheme="majorBidi" w:hAnsiTheme="majorBidi" w:cstheme="majorBidi"/>
-          <w:sz w:val="24"/>
-          <w:szCs w:val="24"/>
-        </w:rPr>
-        <w:fldChar w:fldCharType="separate"/>
-      </w:r>
-      <w:r>
-        <w:rPr>
-          <w:rFonts w:ascii="Cambria" w:hAnsi="Cambria"/>
-          <w:sz w:val="24"/>
-        </w:rPr>
-        <w:t>(</w:t>
-      </w:r>
-      <w:proofErr w:type="spellStart"/>
-      <w:r>
-        <w:rPr>
-          <w:rFonts w:ascii="Cambria" w:hAnsi="Cambria"/>
-          <w:sz w:val="24"/>
-        </w:rPr>
-        <w:t>Suryawanshi</w:t>
-      </w:r>
-      <w:proofErr w:type="spellEnd"/>
-      <w:r>
-        <w:rPr>
-          <w:rFonts w:ascii="Cambria" w:hAnsi="Cambria"/>
-          <w:sz w:val="24"/>
-        </w:rPr>
-        <w:t xml:space="preserve"> et al., 2024)</w:t>
-      </w:r>
-      <w:r>
-        <w:rPr>
-          <w:rFonts w:asciiTheme="majorBidi" w:hAnsiTheme="majorBidi" w:cstheme="majorBidi"/>
-          <w:sz w:val="24"/>
-          <w:szCs w:val="24"/>
-        </w:rPr>
-        <w:fldChar w:fldCharType="end"/>
-      </w:r>
-      <w:r>
-        <w:rPr>
-          <w:rFonts w:asciiTheme="majorBidi" w:hAnsiTheme="majorBidi" w:cstheme="majorBidi"/>
-          <w:sz w:val="24"/>
-          <w:szCs w:val="24"/>
-        </w:rPr>
-        <w:t xml:space="preserve"> During training, the engineered features are supplied to the algorithm, enabling it to learn the relationship between these inputs and the corresponding weekly sales values.</w:t>
-      </w:r>
-    </w:p>
-    <w:p>
-      <w:pPr>
-        <w:spacing w:line="360" w:lineRule="auto"/>
-        <w:rPr>
-          <w:rFonts w:asciiTheme="majorBidi" w:hAnsiTheme="majorBidi" w:cstheme="majorBidi"/>
-          <w:sz w:val="24"/>
-          <w:szCs w:val="24"/>
-        </w:rPr>
-      </w:pPr>
-      <w:r>
-        <w:rPr>
-          <w:rFonts w:asciiTheme="majorBidi" w:hAnsiTheme="majorBidi" w:cstheme="majorBidi"/>
-          <w:sz w:val="24"/>
-          <w:szCs w:val="24"/>
-        </w:rPr>
-        <w:t>In this study, three algorithms were implemented:</w:t>
-      </w:r>
-    </w:p>
-    <w:p>
-      <w:pPr>
-        <w:pStyle w:val="ListParagraph"/>
+    </w:p>
+    <w:p>
+      <w:pPr>
         <w:widowControl/>
-        <w:numPr>
-          <w:ilvl w:val="0"/>
-          <w:numId w:val="8"/>
-        </w:numPr>
-        <w:spacing w:line="360" w:lineRule="auto"/>
-        <w:jc w:val="both"/>
-        <w:rPr>
-          <w:rFonts w:asciiTheme="majorBidi" w:hAnsiTheme="majorBidi" w:cstheme="majorBidi"/>
-          <w:sz w:val="24"/>
-          <w:szCs w:val="24"/>
-        </w:rPr>
-      </w:pPr>
-      <w:r>
-        <w:rPr>
-          <w:rFonts w:asciiTheme="majorBidi" w:hAnsiTheme="majorBidi" w:cstheme="majorBidi"/>
-          <w:sz w:val="24"/>
-          <w:szCs w:val="24"/>
-        </w:rPr>
-        <w:t>Linear Regression, which models the relationship between features and sales through a linear function.</w:t>
-      </w:r>
-      <w:r>
-        <w:rPr>
-          <w:rFonts w:asciiTheme="majorBidi" w:hAnsiTheme="majorBidi" w:cstheme="majorBidi"/>
-          <w:sz w:val="24"/>
-          <w:szCs w:val="24"/>
-        </w:rPr>
-        <w:fldChar w:fldCharType="begin"/>
-      </w:r>
-      <w:r>
-        <w:rPr>
-          <w:rFonts w:asciiTheme="majorBidi" w:hAnsiTheme="majorBidi" w:cstheme="majorBidi"/>
-          <w:sz w:val="24"/>
-          <w:szCs w:val="24"/>
-        </w:rPr>
-        <w:instrText xml:space="preserve"> ADDIN ZOTERO_ITEM CSL_CITATION {"citationID":"0zdWNT4i","properties":{"unsorted":false,"formattedCitation":"(Pedregosa et al., n.d.)","plainCitation":"(Pedregosa et al., n.d.)","noteIndex":0},"citationItems":[{"id":13,"uris":["http://zotero.org/users/local/ZF6vXB9x/items/R4PY5MMF"],"itemData":{"id":13,"type":"article-journal","abstract":"Scikit-learn is a Python module integrating a wide range of state-of-the-art machine learning algorithms for medium-scale supervised and unsupervised problems. This package focuses on bringing machine learning to non-specialists using a general-purpose high-level language. Emphasis is put on ease of use, performance, documentation, and API consistency. It has minimal dependencies and is distributed under the simpliﬁed BSD license, encouraging its use in both academic and commercial settings. Source code, binaries, and documentation can be downloaded from http://scikit-learn.sourceforge.net.","container-title":"MACHINE LEARNING IN PYTHON","language":"en","source":"Zotero","title":"Scikit-learn: Machine Learning in Python","author":[{"family":"Pedregosa","given":"Fabian"},{"family":"Pedregosa","given":"Fabian"},{"family":"Varoquaux","given":"Gael"},{"family":"Varoquaux","given":"Gael"},{"family":"Org","given":"Normalesup"},{"family":"Gramfort","given":"Alexandre"},{"family":"Gramfort","given":"Alexandre"},{"family":"Michel","given":"Vincent"},{"family":"Michel","given":"Vincent"},{"family":"Fr","given":"Logilab"},{"family":"Thirion","given":"Bertrand"},{"family":"Thirion","given":"Bertrand"},{"family":"Grisel","given":"Olivier"},{"family":"Grisel","given":"Olivier"},{"family":"Blondel","given":"Mathieu"},{"family":"Prettenhofer","given":"Peter"},{"family":"Prettenhofer","given":"Peter"},{"family":"Weiss","given":"Ron"},{"family":"Dubourg","given":"Vincent"},{"family":"Dubourg","given":"Vincent"},{"family":"Vanderplas","given":"Jake"},{"family":"Passos","given":"Alexandre"},{"family":"Tp","given":"Alexandre"},{"family":"Cournapeau","given":"David"}]}}],"schema":"https://github.com/citation-style-language/schema/raw/master/csl-citation.json"} </w:instrText>
-      </w:r>
-      <w:r>
-        <w:rPr>
-          <w:rFonts w:asciiTheme="majorBidi" w:hAnsiTheme="majorBidi" w:cstheme="majorBidi"/>
-          <w:sz w:val="24"/>
-          <w:szCs w:val="24"/>
-        </w:rPr>
-        <w:fldChar w:fldCharType="separate"/>
-      </w:r>
-      <w:r>
-        <w:rPr>
-          <w:rFonts w:ascii="Cambria" w:hAnsi="Cambria"/>
-          <w:sz w:val="24"/>
-        </w:rPr>
-        <w:t>(Pedregosa et al., n.d.)</w:t>
-      </w:r>
-      <w:r>
-        <w:rPr>
-          <w:rFonts w:asciiTheme="majorBidi" w:hAnsiTheme="majorBidi" w:cstheme="majorBidi"/>
-          <w:sz w:val="24"/>
-          <w:szCs w:val="24"/>
-        </w:rPr>
-        <w:fldChar w:fldCharType="end"/>
-      </w:r>
-    </w:p>
-    <w:p>
-      <w:pPr>
-        <w:pStyle w:val="ListParagraph"/>
-        <w:widowControl/>
-        <w:numPr>
-          <w:ilvl w:val="0"/>
-          <w:numId w:val="8"/>
-        </w:numPr>
-        <w:spacing w:line="360" w:lineRule="auto"/>
-        <w:jc w:val="both"/>
-        <w:rPr>
-          <w:rFonts w:asciiTheme="majorBidi" w:hAnsiTheme="majorBidi" w:cstheme="majorBidi"/>
-          <w:sz w:val="24"/>
-          <w:szCs w:val="24"/>
-        </w:rPr>
-      </w:pPr>
-      <w:r>
-        <w:rPr>
-          <w:rFonts w:asciiTheme="majorBidi" w:hAnsiTheme="majorBidi" w:cstheme="majorBidi"/>
-          <w:sz w:val="24"/>
-          <w:szCs w:val="24"/>
-        </w:rPr>
-        <w:t>Random Forest, an ensemble</w:t>
+        <w:spacing w:line="360" w:lineRule="auto"/>
+        <w:ind w:left="360"/>
+        <w:jc w:val="both"/>
+        <w:rPr>
+          <w:rFonts w:asciiTheme="majorBidi" w:hAnsiTheme="majorBidi" w:cstheme="majorBidi"/>
+          <w:sz w:val="24"/>
+          <w:szCs w:val="24"/>
+        </w:rPr>
+      </w:pPr>
+      <w:r>
+        <w:rPr>
+          <w:rFonts w:asciiTheme="majorBidi" w:hAnsiTheme="majorBidi" w:cstheme="majorBidi"/>
+          <w:b/>
+          <w:bCs/>
+          <w:sz w:val="24"/>
+          <w:szCs w:val="24"/>
+        </w:rPr>
+        <w:t>Random Forest</w:t>
+      </w:r>
+      <w:r>
+        <w:rPr>
+          <w:rFonts w:asciiTheme="majorBidi" w:hAnsiTheme="majorBidi" w:cstheme="majorBidi"/>
+          <w:sz w:val="24"/>
+          <w:szCs w:val="24"/>
+        </w:rPr>
+        <w:t>, an ensemble</w:t>
       </w:r>
       <w:r>
         <w:rPr>
@@ -3637,23 +3754,7 @@
           <w:rFonts w:ascii="Cambria" w:hAnsi="Cambria"/>
           <w:sz w:val="24"/>
         </w:rPr>
-        <w:t>(</w:t>
-      </w:r>
-      <w:proofErr w:type="spellStart"/>
-      <w:r>
-        <w:rPr>
-          <w:rFonts w:ascii="Cambria" w:hAnsi="Cambria"/>
-          <w:sz w:val="24"/>
-        </w:rPr>
-        <w:t>Breiman</w:t>
-      </w:r>
-      <w:proofErr w:type="spellEnd"/>
-      <w:r>
-        <w:rPr>
-          <w:rFonts w:ascii="Cambria" w:hAnsi="Cambria"/>
-          <w:sz w:val="24"/>
-        </w:rPr>
-        <w:t>, 2001)</w:t>
+        <w:t>(Breiman, 2001)</w:t>
       </w:r>
       <w:r>
         <w:rPr>
@@ -3666,27 +3767,33 @@
     </w:p>
     <w:p>
       <w:pPr>
-        <w:pStyle w:val="ListParagraph"/>
         <w:widowControl/>
-        <w:numPr>
-          <w:ilvl w:val="0"/>
-          <w:numId w:val="8"/>
-        </w:numPr>
-        <w:spacing w:line="360" w:lineRule="auto"/>
-        <w:jc w:val="both"/>
-        <w:rPr>
-          <w:rFonts w:asciiTheme="majorBidi" w:hAnsiTheme="majorBidi" w:cstheme="majorBidi"/>
-          <w:sz w:val="24"/>
-          <w:szCs w:val="24"/>
-        </w:rPr>
-      </w:pPr>
-      <w:r>
-        <w:rPr>
-          <w:rFonts w:asciiTheme="majorBidi" w:hAnsiTheme="majorBidi" w:cstheme="majorBidi"/>
-          <w:sz w:val="24"/>
-          <w:szCs w:val="24"/>
-        </w:rPr>
-        <w:t>XGBoost, a gradient</w:t>
+        <w:spacing w:line="360" w:lineRule="auto"/>
+        <w:ind w:left="360"/>
+        <w:jc w:val="both"/>
+        <w:rPr>
+          <w:rFonts w:asciiTheme="majorBidi" w:hAnsiTheme="majorBidi" w:cstheme="majorBidi"/>
+          <w:sz w:val="24"/>
+          <w:szCs w:val="24"/>
+        </w:rPr>
+      </w:pPr>
+      <w:r>
+        <w:rPr>
+          <w:rFonts w:asciiTheme="majorBidi" w:hAnsiTheme="majorBidi" w:cstheme="majorBidi"/>
+          <w:b/>
+          <w:bCs/>
+          <w:sz w:val="24"/>
+          <w:szCs w:val="24"/>
+        </w:rPr>
+        <w:t>XGBoost</w:t>
+      </w:r>
+      <w:r>
+        <w:rPr>
+          <w:rFonts w:asciiTheme="majorBidi" w:hAnsiTheme="majorBidi" w:cstheme="majorBidi"/>
+          <w:sz w:val="24"/>
+          <w:szCs w:val="24"/>
+        </w:rPr>
+        <w:t>, a gradient</w:t>
       </w:r>
       <w:r>
         <w:rPr>
@@ -3726,23 +3833,7 @@
           <w:rFonts w:ascii="Cambria" w:hAnsi="Cambria"/>
           <w:sz w:val="24"/>
         </w:rPr>
-        <w:t xml:space="preserve">(Chen &amp; </w:t>
-      </w:r>
-      <w:proofErr w:type="spellStart"/>
-      <w:r>
-        <w:rPr>
-          <w:rFonts w:ascii="Cambria" w:hAnsi="Cambria"/>
-          <w:sz w:val="24"/>
-        </w:rPr>
-        <w:t>Guestrin</w:t>
-      </w:r>
-      <w:proofErr w:type="spellEnd"/>
-      <w:r>
-        <w:rPr>
-          <w:rFonts w:ascii="Cambria" w:hAnsi="Cambria"/>
-          <w:sz w:val="24"/>
-        </w:rPr>
-        <w:t>, 2016)</w:t>
+        <w:t>(Chen &amp; Guestrin, 2016)</w:t>
       </w:r>
       <w:r>
         <w:rPr>
@@ -3799,16 +3890,6 @@
           <w:szCs w:val="24"/>
         </w:rPr>
       </w:pPr>
-    </w:p>
-    <w:p>
-      <w:pPr>
-        <w:spacing w:line="360" w:lineRule="auto"/>
-        <w:rPr>
-          <w:rFonts w:asciiTheme="majorBidi" w:hAnsiTheme="majorBidi" w:cstheme="majorBidi"/>
-          <w:sz w:val="24"/>
-          <w:szCs w:val="24"/>
-        </w:rPr>
-      </w:pPr>
       <w:r>
         <w:rPr>
           <w:rFonts w:asciiTheme="majorBidi" w:hAnsiTheme="majorBidi" w:cstheme="majorBidi"/>
@@ -3843,18 +3924,8 @@
           <w:szCs w:val="24"/>
         </w:rPr>
         <w:noBreakHyphen/>
-        <w:t>series data and prevent leakage. Each selected algorithm was then trained on the training set, where the engineered features were used as inputs and the weekly sales values served as targets. This allowed the models to learn the relationships between the features and the sales outcomes before being evaluated on unseen data.</w:t>
-      </w:r>
-    </w:p>
-    <w:p>
-      <w:pPr>
-        <w:spacing w:line="360" w:lineRule="auto"/>
-        <w:rPr>
-          <w:rFonts w:asciiTheme="majorBidi" w:hAnsiTheme="majorBidi" w:cstheme="majorBidi"/>
-          <w:sz w:val="24"/>
-          <w:szCs w:val="24"/>
-        </w:rPr>
-      </w:pPr>
+        <w:t xml:space="preserve">series data and prevent leakage. Each selected algorithm was then trained on the training set, where the engineered features were used as inputs and the weekly sales values served as targets. This allowed the models to learn the </w:t>
+      </w:r>
       <w:r>
         <w:rPr>
           <w:rFonts w:asciiTheme="majorBidi" w:hAnsiTheme="majorBidi" w:cstheme="majorBidi"/>
@@ -3862,6 +3933,24 @@
           <w:szCs w:val="24"/>
         </w:rPr>
         <w:lastRenderedPageBreak/>
+        <w:t>relationships between the features and the sales outcomes before being evaluated on unseen data.</w:t>
+      </w:r>
+    </w:p>
+    <w:p>
+      <w:pPr>
+        <w:spacing w:line="360" w:lineRule="auto"/>
+        <w:rPr>
+          <w:rFonts w:asciiTheme="majorBidi" w:hAnsiTheme="majorBidi" w:cstheme="majorBidi"/>
+          <w:sz w:val="24"/>
+          <w:szCs w:val="24"/>
+        </w:rPr>
+      </w:pPr>
+      <w:r>
+        <w:rPr>
+          <w:rFonts w:asciiTheme="majorBidi" w:hAnsiTheme="majorBidi" w:cstheme="majorBidi"/>
+          <w:sz w:val="24"/>
+          <w:szCs w:val="24"/>
+        </w:rPr>
         <w:t>.</w:t>
       </w:r>
     </w:p>
@@ -4037,7 +4126,7 @@
     <w:p>
       <w:pPr>
         <w:spacing w:line="360" w:lineRule="auto"/>
-        <w:jc w:val="both"/>
+        <w:jc w:val="center"/>
         <w:rPr>
           <w:rFonts w:asciiTheme="majorBidi" w:hAnsiTheme="majorBidi" w:cstheme="majorBidi"/>
           <w:sz w:val="24"/>
@@ -4104,20 +4193,20 @@
     <w:p>
       <w:pPr>
         <w:spacing w:line="360" w:lineRule="auto"/>
-        <w:jc w:val="both"/>
-        <w:rPr>
-          <w:rFonts w:asciiTheme="majorBidi" w:hAnsiTheme="majorBidi" w:cstheme="majorBidi"/>
-          <w:sz w:val="24"/>
-          <w:szCs w:val="24"/>
-        </w:rPr>
-      </w:pPr>
-      <w:r>
-        <w:rPr>
-          <w:rFonts w:asciiTheme="majorBidi" w:hAnsiTheme="majorBidi" w:cstheme="majorBidi"/>
-          <w:sz w:val="24"/>
-          <w:szCs w:val="24"/>
-        </w:rPr>
-        <w:t xml:space="preserve">                                     Fig 3.10. 1 Dashboard Workflow</w:t>
+        <w:jc w:val="center"/>
+        <w:rPr>
+          <w:rFonts w:asciiTheme="majorBidi" w:hAnsiTheme="majorBidi" w:cstheme="majorBidi"/>
+          <w:sz w:val="24"/>
+          <w:szCs w:val="24"/>
+        </w:rPr>
+      </w:pPr>
+      <w:r>
+        <w:rPr>
+          <w:rFonts w:asciiTheme="majorBidi" w:hAnsiTheme="majorBidi" w:cstheme="majorBidi"/>
+          <w:sz w:val="24"/>
+          <w:szCs w:val="24"/>
+        </w:rPr>
+        <w:t>Fig 3.10. 1 Dashboard Workflow</w:t>
       </w:r>
     </w:p>
     <w:p>
@@ -4212,7 +4301,7 @@
           <w:sz w:val="24"/>
           <w:szCs w:val="24"/>
         </w:rPr>
-        <w:t xml:space="preserve"> framework was utilized to develop a dashboard capable of displaying actual and predicted sales in </w:t>
+        <w:t xml:space="preserve"> </w:t>
       </w:r>
       <w:r>
         <w:rPr>
@@ -4221,7 +4310,7 @@
           <w:szCs w:val="24"/>
         </w:rPr>
         <w:lastRenderedPageBreak/>
-        <w:t>real time. All components of the system were developed and managed within the Visual Studio Code environment, which served as the integrated development platform.</w:t>
+        <w:t>framework was utilized to develop a dashboard capable of displaying actual and predicted sales in real time. All components of the system were developed and managed within the Visual Studio Code environment, which served as the integrated development platform.</w:t>
       </w:r>
     </w:p>
     <w:p>
@@ -4345,9 +4434,12 @@
     </w:p>
     <w:p>
       <w:pPr>
-        <w:pStyle w:val="Heading1"/>
-        <w:rPr>
-          <w:rFonts w:ascii="Times New Roman" w:eastAsia="Google Sans" w:hAnsi="Times New Roman" w:cs="Times New Roman"/>
+        <w:widowControl/>
+        <w:spacing w:after="160" w:line="259" w:lineRule="auto"/>
+        <w:rPr>
+          <w:rFonts w:ascii="Times New Roman" w:eastAsia="Google Sans" w:hAnsi="Times New Roman" w:cs="Times New Roman"/>
+          <w:b/>
+          <w:bCs/>
           <w:sz w:val="44"/>
           <w:szCs w:val="44"/>
         </w:rPr>
@@ -4358,6 +4450,25 @@
           <w:sz w:val="44"/>
           <w:szCs w:val="44"/>
         </w:rPr>
+        <w:br w:type="page"/>
+      </w:r>
+    </w:p>
+    <w:p>
+      <w:pPr>
+        <w:pStyle w:val="Heading1"/>
+        <w:rPr>
+          <w:rFonts w:ascii="Times New Roman" w:eastAsia="Google Sans" w:hAnsi="Times New Roman" w:cs="Times New Roman"/>
+          <w:sz w:val="44"/>
+          <w:szCs w:val="44"/>
+        </w:rPr>
+      </w:pPr>
+      <w:r>
+        <w:rPr>
+          <w:rFonts w:ascii="Times New Roman" w:eastAsia="Google Sans" w:hAnsi="Times New Roman" w:cs="Times New Roman"/>
+          <w:sz w:val="44"/>
+          <w:szCs w:val="44"/>
+        </w:rPr>
+        <w:lastRenderedPageBreak/>
         <w:t>References</w:t>
       </w:r>
     </w:p>
@@ -4666,16 +4777,7 @@
           <w:sz w:val="24"/>
           <w:szCs w:val="24"/>
         </w:rPr>
-        <w:t xml:space="preserve">, "The M4 Competition: Results, </w:t>
-      </w:r>
-      <w:r>
-        <w:rPr>
-          <w:rFonts w:ascii="Times New Roman" w:hAnsi="Times New Roman" w:cs="Times New Roman"/>
-          <w:sz w:val="24"/>
-          <w:szCs w:val="24"/>
-        </w:rPr>
-        <w:lastRenderedPageBreak/>
-        <w:t>findings, conclusion and way forward," International Journal of Forecasting, vol. 34, no. 4, pp. 802–808, Oct. 2018.</w:t>
+        <w:t>, "The M4 Competition: Results, findings, conclusion and way forward," International Journal of Forecasting, vol. 34, no. 4, pp. 802–808, Oct. 2018.</w:t>
       </w:r>
     </w:p>
     <w:p>
@@ -4891,6 +4993,7 @@
           <w:sz w:val="24"/>
           <w:szCs w:val="24"/>
         </w:rPr>
+        <w:lastRenderedPageBreak/>
         <w:t xml:space="preserve">[9] A. Vaswani, N. </w:t>
       </w:r>
       <w:proofErr w:type="spellStart"/>
@@ -5155,16 +5258,7 @@
           <w:sz w:val="24"/>
           <w:szCs w:val="24"/>
         </w:rPr>
-        <w:t xml:space="preserve"> and S. Rizzi, Data Warehouse Design: Modern Principles and </w:t>
-      </w:r>
-      <w:r>
-        <w:rPr>
-          <w:rFonts w:ascii="Times New Roman" w:hAnsi="Times New Roman" w:cs="Times New Roman"/>
-          <w:sz w:val="24"/>
-          <w:szCs w:val="24"/>
-        </w:rPr>
-        <w:lastRenderedPageBreak/>
-        <w:t>Methodologies. New York, NY, USA: McGraw-Hill, 2009.</w:t>
+        <w:t xml:space="preserve"> and S. Rizzi, Data Warehouse Design: Modern Principles and Methodologies. New York, NY, USA: McGraw-Hill, 2009.</w:t>
       </w:r>
     </w:p>
     <w:p>
@@ -5338,7 +5432,16 @@
           <w:sz w:val="24"/>
           <w:szCs w:val="24"/>
         </w:rPr>
-        <w:t>[19] S. M. Lundberg and S.-I. Lee, "A unified approach to interpreting model predictions," in Advances in Neural Information Processing Systems, vol. 30, Long Beach, CA, USA, 2017, pp. 4765–4774.</w:t>
+        <w:t xml:space="preserve">[19] S. M. Lundberg and S.-I. Lee, "A unified approach to interpreting model predictions," in Advances in Neural Information Processing Systems, vol. 30, Long Beach, CA, USA, 2017, </w:t>
+      </w:r>
+      <w:r>
+        <w:rPr>
+          <w:rFonts w:ascii="Times New Roman" w:hAnsi="Times New Roman" w:cs="Times New Roman"/>
+          <w:sz w:val="24"/>
+          <w:szCs w:val="24"/>
+        </w:rPr>
+        <w:lastRenderedPageBreak/>
+        <w:t>pp. 4765–4774.</w:t>
       </w:r>
     </w:p>
     <w:p>
@@ -5554,16 +5657,7 @@
           <w:sz w:val="24"/>
           <w:szCs w:val="24"/>
         </w:rPr>
-        <w:t xml:space="preserve">[25] T. Boone, R. Ganeshan, and R. L. Stading, "Forecasting and inventory management for </w:t>
-      </w:r>
-      <w:r>
-        <w:rPr>
-          <w:rFonts w:ascii="Times New Roman" w:hAnsi="Times New Roman" w:cs="Times New Roman"/>
-          <w:sz w:val="24"/>
-          <w:szCs w:val="24"/>
-        </w:rPr>
-        <w:lastRenderedPageBreak/>
-        <w:t>e-commerce: A case study," Journal of Business Logistics, vol. 40, no. 4, pp. 279–291, Dec. 2019.</w:t>
+        <w:t>[25] T. Boone, R. Ganeshan, and R. L. Stading, "Forecasting and inventory management for e-commerce: A case study," Journal of Business Logistics, vol. 40, no. 4, pp. 279–291, Dec. 2019.</w:t>
       </w:r>
     </w:p>
     <w:p>
@@ -5827,7 +5921,16 @@
           <w:sz w:val="24"/>
           <w:szCs w:val="24"/>
         </w:rPr>
-        <w:t xml:space="preserve">[6] M. D. Tamang, V. K. Shukla, S. Anwar, and R. Punhani, “Improving business intelligence through machine learning algorithms,” in 2021 2nd Int. Conf. Intelligent Engineering and Management (ICIEM), 2021, pp. 63–68, </w:t>
+        <w:t xml:space="preserve">[6] M. D. Tamang, V. K. Shukla, S. Anwar, and R. Punhani, “Improving business intelligence </w:t>
+      </w:r>
+      <w:r>
+        <w:rPr>
+          <w:rFonts w:ascii="Times New Roman" w:hAnsi="Times New Roman" w:cs="Times New Roman"/>
+          <w:sz w:val="24"/>
+          <w:szCs w:val="24"/>
+        </w:rPr>
+        <w:lastRenderedPageBreak/>
+        <w:t xml:space="preserve">through machine learning algorithms,” in 2021 2nd Int. Conf. Intelligent Engineering and Management (ICIEM), 2021, pp. 63–68, </w:t>
       </w:r>
       <w:proofErr w:type="spellStart"/>
       <w:r>
@@ -7476,15 +7579,6 @@
   </w:abstractNum>
   <w:num w:numId="1">
     <w:abstractNumId w:val="3"/>
-    <w:lvlOverride w:ilvl="0"/>
-    <w:lvlOverride w:ilvl="1"/>
-    <w:lvlOverride w:ilvl="2"/>
-    <w:lvlOverride w:ilvl="3"/>
-    <w:lvlOverride w:ilvl="4"/>
-    <w:lvlOverride w:ilvl="5"/>
-    <w:lvlOverride w:ilvl="6"/>
-    <w:lvlOverride w:ilvl="7"/>
-    <w:lvlOverride w:ilvl="8"/>
   </w:num>
   <w:num w:numId="2">
     <w:abstractNumId w:val="7"/>
@@ -7502,15 +7596,6 @@
   </w:num>
   <w:num w:numId="3">
     <w:abstractNumId w:val="4"/>
-    <w:lvlOverride w:ilvl="0"/>
-    <w:lvlOverride w:ilvl="1"/>
-    <w:lvlOverride w:ilvl="2"/>
-    <w:lvlOverride w:ilvl="3"/>
-    <w:lvlOverride w:ilvl="4"/>
-    <w:lvlOverride w:ilvl="5"/>
-    <w:lvlOverride w:ilvl="6"/>
-    <w:lvlOverride w:ilvl="7"/>
-    <w:lvlOverride w:ilvl="8"/>
   </w:num>
   <w:num w:numId="4">
     <w:abstractNumId w:val="0"/>
@@ -7528,15 +7613,6 @@
   </w:num>
   <w:num w:numId="5">
     <w:abstractNumId w:val="6"/>
-    <w:lvlOverride w:ilvl="0"/>
-    <w:lvlOverride w:ilvl="1"/>
-    <w:lvlOverride w:ilvl="2"/>
-    <w:lvlOverride w:ilvl="3"/>
-    <w:lvlOverride w:ilvl="4"/>
-    <w:lvlOverride w:ilvl="5"/>
-    <w:lvlOverride w:ilvl="6"/>
-    <w:lvlOverride w:ilvl="7"/>
-    <w:lvlOverride w:ilvl="8"/>
   </w:num>
   <w:num w:numId="6">
     <w:abstractNumId w:val="2"/>
@@ -7546,15 +7622,6 @@
   </w:num>
   <w:num w:numId="8">
     <w:abstractNumId w:val="1"/>
-    <w:lvlOverride w:ilvl="0"/>
-    <w:lvlOverride w:ilvl="1"/>
-    <w:lvlOverride w:ilvl="2"/>
-    <w:lvlOverride w:ilvl="3"/>
-    <w:lvlOverride w:ilvl="4"/>
-    <w:lvlOverride w:ilvl="5"/>
-    <w:lvlOverride w:ilvl="6"/>
-    <w:lvlOverride w:ilvl="7"/>
-    <w:lvlOverride w:ilvl="8"/>
   </w:num>
 </w:numbering>
 </file>
@@ -8032,7 +8099,6 @@
   <w:style w:type="character" w:default="1" w:styleId="DefaultParagraphFont">
     <w:name w:val="Default Paragraph Font"/>
     <w:uiPriority w:val="1"/>
-    <w:semiHidden/>
     <w:unhideWhenUsed/>
   </w:style>
   <w:style w:type="table" w:default="1" w:styleId="TableNormal">

</xml_diff>